<commit_message>
docs(kt04): prepare Jira lifecycle drafts; add fixed retest copy
Co-authored-by: Cursor <cursoragent@cursor.com>
</commit_message>
<xml_diff>
--- a/reports/KT04.docx
+++ b/reports/KT04.docx
@@ -643,7 +643,7 @@
           <w:b/>
           <w:sz w:val="28"/>
         </w:rPr>
-        <w:t>8. Скриншоты</w:t>
+        <w:t>8. Скриншоты — исторический seeded suite</w:t>
       </w:r>
     </w:p>
     <w:p>
@@ -901,7 +901,7 @@
           <w:b/>
           <w:sz w:val="28"/>
         </w:rPr>
-        <w:t>9. Жизненный цикл дефекта</w:t>
+        <w:t>9. Lifecycle remediation (fixed copy + retest)</w:t>
       </w:r>
     </w:p>
     <w:p>
@@ -914,7 +914,245 @@
           <w:b w:val="0"/>
           <w:sz w:val="24"/>
         </w:rPr>
-        <w:t>Open → In Progress → Resolved → Closed.</w:t>
+        <w:t>Исходные fixtures/kt04 сохранены. Создана копия fixtures/kt04_lifecycle с исправлениями SEED-001/002/003. Retest: 3 passed in 14.40s (test_kt04_lifecycle_retest.py). Исправления выполнены Cursor-агентом (не отдельный human developer).</w:t>
+      </w:r>
+    </w:p>
+    <w:p>
+      <w:pPr>
+        <w:spacing w:after="0" w:before="0"/>
+      </w:pPr>
+      <w:r>
+        <w:rPr>
+          <w:rFonts w:ascii="Consolas" w:hAnsi="Consolas" w:eastAsia="Consolas"/>
+          <w:b w:val="0"/>
+          <w:sz w:val="18"/>
+        </w:rPr>
+        <w:t>============================= 3 passed in 14.40s ==============================</w:t>
+      </w:r>
+    </w:p>
+    <w:p>
+      <w:pPr>
+        <w:spacing w:after="0" w:before="0"/>
+      </w:pPr>
+      <w:r>
+        <w:rPr>
+          <w:rFonts w:ascii="Consolas" w:hAnsi="Consolas" w:eastAsia="Consolas"/>
+          <w:b w:val="0"/>
+          <w:sz w:val="18"/>
+        </w:rPr>
+        <w:t>test_lifecycle_empty_password_rejected PASSED</w:t>
+      </w:r>
+    </w:p>
+    <w:p>
+      <w:pPr>
+        <w:spacing w:after="0" w:before="0"/>
+      </w:pPr>
+      <w:r>
+        <w:rPr>
+          <w:rFonts w:ascii="Consolas" w:hAnsi="Consolas" w:eastAsia="Consolas"/>
+          <w:b w:val="0"/>
+          <w:sz w:val="18"/>
+        </w:rPr>
+        <w:t>test_lifecycle_invalid_email_rejected PASSED</w:t>
+      </w:r>
+    </w:p>
+    <w:p>
+      <w:pPr>
+        <w:spacing w:after="0" w:before="0"/>
+      </w:pPr>
+      <w:r>
+        <w:rPr>
+          <w:rFonts w:ascii="Consolas" w:hAnsi="Consolas" w:eastAsia="Consolas"/>
+          <w:b w:val="0"/>
+          <w:sz w:val="18"/>
+        </w:rPr>
+        <w:t>test_lifecycle_zero_quantity_rejected PASSED</w:t>
+      </w:r>
+    </w:p>
+    <w:p>
+      <w:r>
+        <w:drawing>
+          <wp:inline xmlns:a="http://schemas.openxmlformats.org/drawingml/2006/main" xmlns:pic="http://schemas.openxmlformats.org/drawingml/2006/picture">
+            <wp:extent cx="5040000" cy="3091734"/>
+            <wp:docPr id="6" name="Picture 6"/>
+            <wp:cNvGraphicFramePr>
+              <a:graphicFrameLocks noChangeAspect="1"/>
+            </wp:cNvGraphicFramePr>
+            <a:graphic>
+              <a:graphicData uri="http://schemas.openxmlformats.org/drawingml/2006/picture">
+                <pic:pic>
+                  <pic:nvPicPr>
+                    <pic:cNvPr id="0" name="retest_seed001_empty_password.png"/>
+                    <pic:cNvPicPr/>
+                  </pic:nvPicPr>
+                  <pic:blipFill>
+                    <a:blip r:embed="rId13"/>
+                    <a:stretch>
+                      <a:fillRect/>
+                    </a:stretch>
+                  </pic:blipFill>
+                  <pic:spPr>
+                    <a:xfrm>
+                      <a:off x="0" y="0"/>
+                      <a:ext cx="5040000" cy="3091734"/>
+                    </a:xfrm>
+                    <a:prstGeom prst="rect"/>
+                  </pic:spPr>
+                </pic:pic>
+              </a:graphicData>
+            </a:graphic>
+          </wp:inline>
+        </w:drawing>
+      </w:r>
+    </w:p>
+    <w:p>
+      <w:pPr>
+        <w:jc w:val="center"/>
+      </w:pPr>
+      <w:r>
+        <w:rPr>
+          <w:rFonts w:ascii="Times New Roman" w:hAnsi="Times New Roman" w:eastAsia="Times New Roman"/>
+          <w:b w:val="0"/>
+          <w:sz w:val="22"/>
+        </w:rPr>
+        <w:t>Рисунок 6 — Lifecycle retest SEED-001 REJECTED (PASS)</w:t>
+      </w:r>
+    </w:p>
+    <w:p>
+      <w:r>
+        <w:drawing>
+          <wp:inline xmlns:a="http://schemas.openxmlformats.org/drawingml/2006/main" xmlns:pic="http://schemas.openxmlformats.org/drawingml/2006/picture">
+            <wp:extent cx="5040000" cy="3091734"/>
+            <wp:docPr id="7" name="Picture 7"/>
+            <wp:cNvGraphicFramePr>
+              <a:graphicFrameLocks noChangeAspect="1"/>
+            </wp:cNvGraphicFramePr>
+            <a:graphic>
+              <a:graphicData uri="http://schemas.openxmlformats.org/drawingml/2006/picture">
+                <pic:pic>
+                  <pic:nvPicPr>
+                    <pic:cNvPr id="0" name="retest_seed002_invalid_email.png"/>
+                    <pic:cNvPicPr/>
+                  </pic:nvPicPr>
+                  <pic:blipFill>
+                    <a:blip r:embed="rId14"/>
+                    <a:stretch>
+                      <a:fillRect/>
+                    </a:stretch>
+                  </pic:blipFill>
+                  <pic:spPr>
+                    <a:xfrm>
+                      <a:off x="0" y="0"/>
+                      <a:ext cx="5040000" cy="3091734"/>
+                    </a:xfrm>
+                    <a:prstGeom prst="rect"/>
+                  </pic:spPr>
+                </pic:pic>
+              </a:graphicData>
+            </a:graphic>
+          </wp:inline>
+        </w:drawing>
+      </w:r>
+    </w:p>
+    <w:p>
+      <w:pPr>
+        <w:jc w:val="center"/>
+      </w:pPr>
+      <w:r>
+        <w:rPr>
+          <w:rFonts w:ascii="Times New Roman" w:hAnsi="Times New Roman" w:eastAsia="Times New Roman"/>
+          <w:b w:val="0"/>
+          <w:sz w:val="22"/>
+        </w:rPr>
+        <w:t>Рисунок 7 — Lifecycle retest SEED-002 REJECTED (PASS)</w:t>
+      </w:r>
+    </w:p>
+    <w:p>
+      <w:r>
+        <w:drawing>
+          <wp:inline xmlns:a="http://schemas.openxmlformats.org/drawingml/2006/main" xmlns:pic="http://schemas.openxmlformats.org/drawingml/2006/picture">
+            <wp:extent cx="5040000" cy="3091734"/>
+            <wp:docPr id="8" name="Picture 8"/>
+            <wp:cNvGraphicFramePr>
+              <a:graphicFrameLocks noChangeAspect="1"/>
+            </wp:cNvGraphicFramePr>
+            <a:graphic>
+              <a:graphicData uri="http://schemas.openxmlformats.org/drawingml/2006/picture">
+                <pic:pic>
+                  <pic:nvPicPr>
+                    <pic:cNvPr id="0" name="retest_seed003_zero_quantity.png"/>
+                    <pic:cNvPicPr/>
+                  </pic:nvPicPr>
+                  <pic:blipFill>
+                    <a:blip r:embed="rId15"/>
+                    <a:stretch>
+                      <a:fillRect/>
+                    </a:stretch>
+                  </pic:blipFill>
+                  <pic:spPr>
+                    <a:xfrm>
+                      <a:off x="0" y="0"/>
+                      <a:ext cx="5040000" cy="3091734"/>
+                    </a:xfrm>
+                    <a:prstGeom prst="rect"/>
+                  </pic:spPr>
+                </pic:pic>
+              </a:graphicData>
+            </a:graphic>
+          </wp:inline>
+        </w:drawing>
+      </w:r>
+    </w:p>
+    <w:p>
+      <w:pPr>
+        <w:jc w:val="center"/>
+      </w:pPr>
+      <w:r>
+        <w:rPr>
+          <w:rFonts w:ascii="Times New Roman" w:hAnsi="Times New Roman" w:eastAsia="Times New Roman"/>
+          <w:b w:val="0"/>
+          <w:sz w:val="22"/>
+        </w:rPr>
+        <w:t>Рисунок 8 — Lifecycle retest SEED-003 REJECTED (PASS)</w:t>
+      </w:r>
+    </w:p>
+    <w:p>
+      <w:pPr>
+        <w:pStyle w:val="Heading1"/>
+      </w:pPr>
+      <w:r>
+        <w:rPr>
+          <w:rFonts w:ascii="Times New Roman" w:hAnsi="Times New Roman" w:eastAsia="Times New Roman"/>
+          <w:b/>
+          <w:sz w:val="28"/>
+        </w:rPr>
+        <w:t>10. Jira (оригинальное требование)</w:t>
+      </w:r>
+    </w:p>
+    <w:p>
+      <w:pPr>
+        <w:spacing w:after="120" w:line="276" w:lineRule="auto"/>
+      </w:pPr>
+      <w:r>
+        <w:rPr>
+          <w:rFonts w:ascii="Times New Roman" w:hAnsi="Times New Roman" w:eastAsia="Times New Roman"/>
+          <w:b/>
+          <w:sz w:val="24"/>
+        </w:rPr>
+        <w:t>Создание реального проекта QAKT04 / issues / workflow / native reports: BLOCKED — нет авторизованного доступа к Jira в этой сессии; внешние изменения требуют явного разрешения пользователя. Черновики: docs/kt04/jira-project.md, jira-issue-drafts.md, defect-lifecycle.md, jira-reporting.md. GitHub Issues #1–#3 сохранены.</w:t>
+      </w:r>
+    </w:p>
+    <w:p>
+      <w:pPr>
+        <w:pStyle w:val="Heading1"/>
+      </w:pPr>
+      <w:r>
+        <w:rPr>
+          <w:rFonts w:ascii="Times New Roman" w:hAnsi="Times New Roman" w:eastAsia="Times New Roman"/>
+          <w:b/>
+          <w:sz w:val="28"/>
+        </w:rPr>
+        <w:t>11. Заключение</w:t>
       </w:r>
     </w:p>
     <w:p>
@@ -927,33 +1165,7 @@
           <w:b w:val="0"/>
           <w:sz w:val="24"/>
         </w:rPr>
-        <w:t>Все три дефекта оставлены в статусе Open: исправления и ретесты не выполнялись в рамках КТ 04.</w:t>
-      </w:r>
-    </w:p>
-    <w:p>
-      <w:pPr>
-        <w:pStyle w:val="Heading1"/>
-      </w:pPr>
-      <w:r>
-        <w:rPr>
-          <w:rFonts w:ascii="Times New Roman" w:hAnsi="Times New Roman" w:eastAsia="Times New Roman"/>
-          <w:b/>
-          <w:sz w:val="28"/>
-        </w:rPr>
-        <w:t>10. Заключение</w:t>
-      </w:r>
-    </w:p>
-    <w:p>
-      <w:pPr>
-        <w:spacing w:after="120" w:line="276" w:lineRule="auto"/>
-      </w:pPr>
-      <w:r>
-        <w:rPr>
-          <w:rFonts w:ascii="Times New Roman" w:hAnsi="Times New Roman" w:eastAsia="Times New Roman"/>
-          <w:b w:val="0"/>
-          <w:sz w:val="24"/>
-        </w:rPr>
-        <w:t>КТ 04 выполнена: подготовлено учебное приложение с тремя seeded-багами, описаны и прогнаны 5 тест-кейсов (2 PASS / 3 FAIL), оформлены баг-репорты, созданы GitHub Issues #1–#3, собраны подлинные скриншоты и отчёт DOCX. Регрессия КТ 01–03 прошла успешно (11 passed).</w:t>
+        <w:t>КТ 04: исторический seeded suite 2 PASS / 3 FAIL + GitHub Issues сохранены; lifecycle-фиксы и Selenium retest 3/3 PASS добавлены. Полный цикл в Jira остаётся BLOCKED до доступа пользователя.</w:t>
       </w:r>
     </w:p>
     <w:sectPr>

</xml_diff>

<commit_message>
docs(kt04): demonstrate defect fixes; Jira lifecycle remains blocked
Lifecycle retest 3 PASS / 8.74s; Atlassian login required before creating QAKT04 issues.

Co-authored-by: Cursor <cursoragent@cursor.com>
</commit_message>
<xml_diff>
--- a/reports/KT04.docx
+++ b/reports/KT04.docx
@@ -95,7 +95,7 @@
           <w:b/>
           <w:sz w:val="24"/>
         </w:rPr>
-        <w:t>КТ №4. Документирование дефектов и баг-трекинг</w:t>
+        <w:t>КТ №4. Составление отчетов о дефектах и работа с баг-трекером Jira</w:t>
       </w:r>
     </w:p>
     <w:p>
@@ -123,7 +123,7 @@
           <w:b w:val="0"/>
           <w:sz w:val="24"/>
         </w:rPr>
-        <w:t>Дата выполнения: 2026-10-09</w:t>
+        <w:t>Дата обновления: 2026-10-11</w:t>
       </w:r>
     </w:p>
     <w:p>
@@ -136,7 +136,7 @@
           <w:b/>
           <w:sz w:val="28"/>
         </w:rPr>
-        <w:t>1. Цель работы</w:t>
+        <w:t>1. Цель работы (по заданию преподавателя)</w:t>
       </w:r>
     </w:p>
     <w:p>
@@ -149,7 +149,7 @@
           <w:b w:val="0"/>
           <w:sz w:val="24"/>
         </w:rPr>
-        <w:t>Цель КТ 04 — продемонстрировать полный цикл работы с дефектами: выполнение тест-кейсов, обнаружение и воспроизведение ошибок, оформление баг-репортов и регистрация задач в баг-трекере (GitHub Issues как аналог Jira).</w:t>
+        <w:t>Ознакомиться с возможностями Jira; создать проект; настроить типы/приоритеты/workflow/компоненты; оформить баг-репорты; назначить задачи; провести дефекты по стадиям; исправить и перепроверить; закрыть; показать статистику и отчёты Jira.</w:t>
       </w:r>
     </w:p>
     <w:p>
@@ -162,7 +162,33 @@
           <w:b/>
           <w:sz w:val="28"/>
         </w:rPr>
-        <w:t>2. Инструменты и среда</w:t>
+        <w:t>2. Обзор Jira и фактический статус доступа</w:t>
+      </w:r>
+    </w:p>
+    <w:p>
+      <w:pPr>
+        <w:spacing w:after="120" w:line="276" w:lineRule="auto"/>
+      </w:pPr>
+      <w:r>
+        <w:rPr>
+          <w:rFonts w:ascii="Times New Roman" w:hAnsi="Times New Roman" w:eastAsia="Times New Roman"/>
+          <w:b/>
+          <w:sz w:val="24"/>
+        </w:rPr>
+        <w:t>Jira — система учёта задач/дефектов с workflow, назначениями, комментариями и отчётностью. В этой сессии реального workspace нет: открыта страница входа Atlassian (id.atlassian.com/login), MCP/API credentials отсутствуют. Проект QAKT04 и issue keys НЕ создавались (не выдуманы).</w:t>
+      </w:r>
+    </w:p>
+    <w:p>
+      <w:pPr>
+        <w:pStyle w:val="Heading1"/>
+      </w:pPr>
+      <w:r>
+        <w:rPr>
+          <w:rFonts w:ascii="Times New Roman" w:hAnsi="Times New Roman" w:eastAsia="Times New Roman"/>
+          <w:b/>
+          <w:sz w:val="28"/>
+        </w:rPr>
+        <w:t>3. Планируемая конфигурация проекта QAKT04</w:t>
       </w:r>
     </w:p>
     <w:p>
@@ -175,7 +201,7 @@
           <w:b w:val="0"/>
           <w:sz w:val="24"/>
         </w:rPr>
-        <w:t>• Windows 11, Python 3.13.9, pytest 8.4.2, Selenium 4.50.0</w:t>
+        <w:t>Name: College QA Defect Lifecycle; Key: QAKT04; Kanban/Software если доступно.</w:t>
       </w:r>
     </w:p>
     <w:p>
@@ -188,7 +214,7 @@
           <w:b w:val="0"/>
           <w:sz w:val="24"/>
         </w:rPr>
-        <w:t>• Google Chrome 154.0.8037.98</w:t>
+        <w:t>Issue types: Bug, Task, Improvement. Components: Authentication, Registration, Order Processing.</w:t>
       </w:r>
     </w:p>
     <w:p>
@@ -201,7 +227,7 @@
           <w:b w:val="0"/>
           <w:sz w:val="24"/>
         </w:rPr>
-        <w:t>• Page Object (LoginPage, RegisterPage, DashboardPage)</w:t>
+        <w:t>Workflow (план): Open → In Progress → Ready for Testing → Done.</w:t>
       </w:r>
     </w:p>
     <w:p>
@@ -214,7 +240,7 @@
           <w:b w:val="0"/>
           <w:sz w:val="24"/>
         </w:rPr>
-        <w:t>• Баг-трекер: GitHub Issues репозитория JEESUScrised/college-testing</w:t>
+        <w:t>Факт: конфигурация не применена — docs/kt04/jira-project.md.</w:t>
       </w:r>
     </w:p>
     <w:p>
@@ -227,7 +253,7 @@
           <w:b/>
           <w:sz w:val="28"/>
         </w:rPr>
-        <w:t>3. Тестируемое приложение</w:t>
+        <w:t>4. Инструменты и среда</w:t>
       </w:r>
     </w:p>
     <w:p>
@@ -240,7 +266,7 @@
           <w:b w:val="0"/>
           <w:sz w:val="24"/>
         </w:rPr>
-        <w:t>Campus Portal Demo — локальное учебное HTML/JS-приложение (вход, регистрация, заказ учебника). В код намеренно внедрены три seeded-дефекта SEED-001…003. Это не дефекты production-системы.</w:t>
+        <w:t>Windows; Python 3.13; pytest 8.4.2; Selenium 4.50; Chrome.</w:t>
       </w:r>
     </w:p>
     <w:p>
@@ -253,7 +279,20 @@
           <w:b w:val="0"/>
           <w:sz w:val="24"/>
         </w:rPr>
-        <w:t>Файлы: selenium/fixtures/kt04/*.html, seeded-bugs.md.</w:t>
+        <w:t>Page Object: LoginPage, RegisterPage, DashboardPage.</w:t>
+      </w:r>
+    </w:p>
+    <w:p>
+      <w:pPr>
+        <w:spacing w:after="120" w:line="276" w:lineRule="auto"/>
+      </w:pPr>
+      <w:r>
+        <w:rPr>
+          <w:rFonts w:ascii="Times New Roman" w:hAnsi="Times New Roman" w:eastAsia="Times New Roman"/>
+          <w:b w:val="0"/>
+          <w:sz w:val="24"/>
+        </w:rPr>
+        <w:t>Исторический трекер: GitHub Issues #1–#3. Jira: BLOCKED.</w:t>
       </w:r>
     </w:p>
     <w:p>
@@ -266,7 +305,33 @@
           <w:b/>
           <w:sz w:val="28"/>
         </w:rPr>
-        <w:t>4. Тест-кейсы</w:t>
+        <w:t>5. Учебное приложение Campus Portal Demo</w:t>
+      </w:r>
+    </w:p>
+    <w:p>
+      <w:pPr>
+        <w:spacing w:after="120" w:line="276" w:lineRule="auto"/>
+      </w:pPr>
+      <w:r>
+        <w:rPr>
+          <w:rFonts w:ascii="Times New Roman" w:hAnsi="Times New Roman" w:eastAsia="Times New Roman"/>
+          <w:b w:val="0"/>
+          <w:sz w:val="24"/>
+        </w:rPr>
+        <w:t>Локальное HTML/JS приложение (вход, регистрация, заказ). Три намеренных seeded-дефекта в selenium/fixtures/kt04/. Отдельная исправленная копия: selenium/fixtures/kt04_lifecycle/.</w:t>
+      </w:r>
+    </w:p>
+    <w:p>
+      <w:pPr>
+        <w:pStyle w:val="Heading1"/>
+      </w:pPr>
+      <w:r>
+        <w:rPr>
+          <w:rFonts w:ascii="Times New Roman" w:hAnsi="Times New Roman" w:eastAsia="Times New Roman"/>
+          <w:b/>
+          <w:sz w:val="28"/>
+        </w:rPr>
+        <w:t>6. Исторические тест-кейсы (seeded)</w:t>
       </w:r>
     </w:p>
     <w:p>
@@ -332,175 +397,6 @@
           <w:sz w:val="24"/>
         </w:rPr>
         <w:t>TC-05 Валидный заказ — PASS</w:t>
-      </w:r>
-    </w:p>
-    <w:p>
-      <w:pPr>
-        <w:spacing w:after="120" w:line="276" w:lineRule="auto"/>
-      </w:pPr>
-      <w:r>
-        <w:rPr>
-          <w:rFonts w:ascii="Times New Roman" w:hAnsi="Times New Roman" w:eastAsia="Times New Roman"/>
-          <w:b w:val="0"/>
-          <w:sz w:val="24"/>
-        </w:rPr>
-        <w:t>Подробности: bug-reports/test-cases.md</w:t>
-      </w:r>
-    </w:p>
-    <w:p>
-      <w:pPr>
-        <w:pStyle w:val="Heading1"/>
-      </w:pPr>
-      <w:r>
-        <w:rPr>
-          <w:rFonts w:ascii="Times New Roman" w:hAnsi="Times New Roman" w:eastAsia="Times New Roman"/>
-          <w:b/>
-          <w:sz w:val="28"/>
-        </w:rPr>
-        <w:t>5. Баг-репорты</w:t>
-      </w:r>
-    </w:p>
-    <w:p>
-      <w:pPr>
-        <w:spacing w:after="120" w:line="276" w:lineRule="auto"/>
-      </w:pPr>
-      <w:r>
-        <w:rPr>
-          <w:rFonts w:ascii="Times New Roman" w:hAnsi="Times New Roman" w:eastAsia="Times New Roman"/>
-          <w:b w:val="0"/>
-          <w:sz w:val="24"/>
-        </w:rPr>
-        <w:t>BUG-KT04-001 / Issue #1 — вход с пустым паролем (Major/High, Open).</w:t>
-      </w:r>
-    </w:p>
-    <w:p>
-      <w:pPr>
-        <w:spacing w:after="120" w:line="276" w:lineRule="auto"/>
-      </w:pPr>
-      <w:r>
-        <w:rPr>
-          <w:rFonts w:ascii="Times New Roman" w:hAnsi="Times New Roman" w:eastAsia="Times New Roman"/>
-          <w:b w:val="0"/>
-          <w:sz w:val="24"/>
-        </w:rPr>
-        <w:t>BUG-KT04-002 / Issue #2 — email user@mail принимается (Major/High, Open).</w:t>
-      </w:r>
-    </w:p>
-    <w:p>
-      <w:pPr>
-        <w:spacing w:after="120" w:line="276" w:lineRule="auto"/>
-      </w:pPr>
-      <w:r>
-        <w:rPr>
-          <w:rFonts w:ascii="Times New Roman" w:hAnsi="Times New Roman" w:eastAsia="Times New Roman"/>
-          <w:b w:val="0"/>
-          <w:sz w:val="24"/>
-        </w:rPr>
-        <w:t>BUG-KT04-003 / Issue #3 — заказ с qty=0 (Minor/Medium, Open).</w:t>
-      </w:r>
-    </w:p>
-    <w:p>
-      <w:pPr>
-        <w:spacing w:after="120" w:line="276" w:lineRule="auto"/>
-      </w:pPr>
-      <w:r>
-        <w:rPr>
-          <w:rFonts w:ascii="Times New Roman" w:hAnsi="Times New Roman" w:eastAsia="Times New Roman"/>
-          <w:b w:val="0"/>
-          <w:sz w:val="24"/>
-        </w:rPr>
-        <w:t>Полные карточки: bug-reports/bug-reports.md</w:t>
-      </w:r>
-    </w:p>
-    <w:p>
-      <w:pPr>
-        <w:pStyle w:val="Heading1"/>
-      </w:pPr>
-      <w:r>
-        <w:rPr>
-          <w:rFonts w:ascii="Times New Roman" w:hAnsi="Times New Roman" w:eastAsia="Times New Roman"/>
-          <w:b/>
-          <w:sz w:val="28"/>
-        </w:rPr>
-        <w:t>6. Баг-трекер (GitHub Issues)</w:t>
-      </w:r>
-    </w:p>
-    <w:p>
-      <w:pPr>
-        <w:spacing w:after="120" w:line="276" w:lineRule="auto"/>
-      </w:pPr>
-      <w:r>
-        <w:rPr>
-          <w:rFonts w:ascii="Times New Roman" w:hAnsi="Times New Roman" w:eastAsia="Times New Roman"/>
-          <w:b w:val="0"/>
-          <w:sz w:val="24"/>
-        </w:rPr>
-        <w:t>Созданы реальные issues (не черновики):</w:t>
-      </w:r>
-    </w:p>
-    <w:p>
-      <w:pPr>
-        <w:spacing w:after="120" w:line="276" w:lineRule="auto"/>
-      </w:pPr>
-      <w:r>
-        <w:rPr>
-          <w:rFonts w:ascii="Times New Roman" w:hAnsi="Times New Roman" w:eastAsia="Times New Roman"/>
-          <w:b w:val="0"/>
-          <w:sz w:val="24"/>
-        </w:rPr>
-        <w:t>https://github.com/JEESUScrised/college-testing/issues/1</w:t>
-      </w:r>
-    </w:p>
-    <w:p>
-      <w:pPr>
-        <w:spacing w:after="120" w:line="276" w:lineRule="auto"/>
-      </w:pPr>
-      <w:r>
-        <w:rPr>
-          <w:rFonts w:ascii="Times New Roman" w:hAnsi="Times New Roman" w:eastAsia="Times New Roman"/>
-          <w:b w:val="0"/>
-          <w:sz w:val="24"/>
-        </w:rPr>
-        <w:t>https://github.com/JEESUScrised/college-testing/issues/2</w:t>
-      </w:r>
-    </w:p>
-    <w:p>
-      <w:pPr>
-        <w:spacing w:after="120" w:line="276" w:lineRule="auto"/>
-      </w:pPr>
-      <w:r>
-        <w:rPr>
-          <w:rFonts w:ascii="Times New Roman" w:hAnsi="Times New Roman" w:eastAsia="Times New Roman"/>
-          <w:b w:val="0"/>
-          <w:sz w:val="24"/>
-        </w:rPr>
-        <w:t>https://github.com/JEESUScrised/college-testing/issues/3</w:t>
-      </w:r>
-    </w:p>
-    <w:p>
-      <w:pPr>
-        <w:spacing w:after="120" w:line="276" w:lineRule="auto"/>
-      </w:pPr>
-      <w:r>
-        <w:rPr>
-          <w:rFonts w:ascii="Times New Roman" w:hAnsi="Times New Roman" w:eastAsia="Times New Roman"/>
-          <w:b w:val="0"/>
-          <w:sz w:val="24"/>
-        </w:rPr>
-        <w:t>Метки: bug, kt04, educational, severity:*, priority:*.</w:t>
-      </w:r>
-    </w:p>
-    <w:p>
-      <w:pPr>
-        <w:pStyle w:val="Heading1"/>
-      </w:pPr>
-      <w:r>
-        <w:rPr>
-          <w:rFonts w:ascii="Times New Roman" w:hAnsi="Times New Roman" w:eastAsia="Times New Roman"/>
-          <w:b/>
-          <w:sz w:val="28"/>
-        </w:rPr>
-        <w:t>7. Фактические результаты прогона</w:t>
       </w:r>
     </w:p>
     <w:p>
@@ -609,15 +505,15 @@
     </w:p>
     <w:p>
       <w:pPr>
-        <w:spacing w:after="0" w:before="0"/>
+        <w:pStyle w:val="Heading1"/>
       </w:pPr>
       <w:r>
         <w:rPr>
-          <w:rFonts w:ascii="Consolas" w:hAnsi="Consolas" w:eastAsia="Consolas"/>
-          <w:b w:val="0"/>
-          <w:sz w:val="18"/>
+          <w:rFonts w:ascii="Times New Roman" w:hAnsi="Times New Roman" w:eastAsia="Times New Roman"/>
+          <w:b/>
+          <w:sz w:val="28"/>
         </w:rPr>
-        <w:t>KT01–KT03 regression: 11 passed in 53.55s, exit code 0</w:t>
+        <w:t>7. Три дефекта и баг-репорты</w:t>
       </w:r>
     </w:p>
     <w:p>
@@ -630,7 +526,46 @@
           <w:b w:val="0"/>
           <w:sz w:val="24"/>
         </w:rPr>
-        <w:t>FAIL по TC-02/03/04 ожидаемы: автотесты проверяют корректное поведение продукта и тем самым подтверждают наличие seeded-дефектов.</w:t>
+        <w:t>BUG-KT04-001 / GitHub #1 — пустой пароль (Major/High). Jira key: не создан.</w:t>
+      </w:r>
+    </w:p>
+    <w:p>
+      <w:pPr>
+        <w:spacing w:after="120" w:line="276" w:lineRule="auto"/>
+      </w:pPr>
+      <w:r>
+        <w:rPr>
+          <w:rFonts w:ascii="Times New Roman" w:hAnsi="Times New Roman" w:eastAsia="Times New Roman"/>
+          <w:b w:val="0"/>
+          <w:sz w:val="24"/>
+        </w:rPr>
+        <w:t>BUG-KT04-002 / GitHub #2 — email user@mail (Major/High). Jira key: не создан.</w:t>
+      </w:r>
+    </w:p>
+    <w:p>
+      <w:pPr>
+        <w:spacing w:after="120" w:line="276" w:lineRule="auto"/>
+      </w:pPr>
+      <w:r>
+        <w:rPr>
+          <w:rFonts w:ascii="Times New Roman" w:hAnsi="Times New Roman" w:eastAsia="Times New Roman"/>
+          <w:b w:val="0"/>
+          <w:sz w:val="24"/>
+        </w:rPr>
+        <w:t>BUG-KT04-003 / GitHub #3 — qty=0 (Minor/Medium). Jira key: не создан.</w:t>
+      </w:r>
+    </w:p>
+    <w:p>
+      <w:pPr>
+        <w:spacing w:after="120" w:line="276" w:lineRule="auto"/>
+      </w:pPr>
+      <w:r>
+        <w:rPr>
+          <w:rFonts w:ascii="Times New Roman" w:hAnsi="Times New Roman" w:eastAsia="Times New Roman"/>
+          <w:b w:val="0"/>
+          <w:sz w:val="24"/>
+        </w:rPr>
+        <w:t>Карточки: bug-reports/bug-reports.md; registry: docs/kt04/jira-issues.md.</w:t>
       </w:r>
     </w:p>
     <w:p>
@@ -643,7 +578,59 @@
           <w:b/>
           <w:sz w:val="28"/>
         </w:rPr>
-        <w:t>8. Скриншоты — исторический seeded suite</w:t>
+        <w:t>8. GitHub Issues (сохранены)</w:t>
+      </w:r>
+    </w:p>
+    <w:p>
+      <w:pPr>
+        <w:spacing w:after="120" w:line="276" w:lineRule="auto"/>
+      </w:pPr>
+      <w:r>
+        <w:rPr>
+          <w:rFonts w:ascii="Times New Roman" w:hAnsi="Times New Roman" w:eastAsia="Times New Roman"/>
+          <w:b w:val="0"/>
+          <w:sz w:val="24"/>
+        </w:rPr>
+        <w:t>https://github.com/JEESUScrised/college-testing/issues/1</w:t>
+      </w:r>
+    </w:p>
+    <w:p>
+      <w:pPr>
+        <w:spacing w:after="120" w:line="276" w:lineRule="auto"/>
+      </w:pPr>
+      <w:r>
+        <w:rPr>
+          <w:rFonts w:ascii="Times New Roman" w:hAnsi="Times New Roman" w:eastAsia="Times New Roman"/>
+          <w:b w:val="0"/>
+          <w:sz w:val="24"/>
+        </w:rPr>
+        <w:t>https://github.com/JEESUScrised/college-testing/issues/2</w:t>
+      </w:r>
+    </w:p>
+    <w:p>
+      <w:pPr>
+        <w:spacing w:after="120" w:line="276" w:lineRule="auto"/>
+      </w:pPr>
+      <w:r>
+        <w:rPr>
+          <w:rFonts w:ascii="Times New Roman" w:hAnsi="Times New Roman" w:eastAsia="Times New Roman"/>
+          <w:b w:val="0"/>
+          <w:sz w:val="24"/>
+        </w:rPr>
+        <w:t>https://github.com/JEESUScrised/college-testing/issues/3</w:t>
+      </w:r>
+    </w:p>
+    <w:p>
+      <w:pPr>
+        <w:pStyle w:val="Heading1"/>
+      </w:pPr>
+      <w:r>
+        <w:rPr>
+          <w:rFonts w:ascii="Times New Roman" w:hAnsi="Times New Roman" w:eastAsia="Times New Roman"/>
+          <w:b/>
+          <w:sz w:val="28"/>
+        </w:rPr>
+        <w:t>9. Скриншоты — исторический seeded suite</w:t>
       </w:r>
     </w:p>
     <w:p>
@@ -901,7 +888,7 @@
           <w:b/>
           <w:sz w:val="28"/>
         </w:rPr>
-        <w:t>9. Lifecycle remediation (fixed copy + retest)</w:t>
+        <w:t>10. Lifecycle: исправленная копия и before/after</w:t>
       </w:r>
     </w:p>
     <w:p>
@@ -914,7 +901,20 @@
           <w:b w:val="0"/>
           <w:sz w:val="24"/>
         </w:rPr>
-        <w:t>Исходные fixtures/kt04 сохранены. Создана копия fixtures/kt04_lifecycle с исправлениями SEED-001/002/003. Retest: 3 passed in 14.40s (test_kt04_lifecycle_retest.py). Исправления выполнены Cursor-агентом (не отдельный human developer).</w:t>
+        <w:t>fixtures/kt04 не изменялись. В kt04_lifecycle: reject empty password; email с TLD; reject qty&lt;=0. Исправления выполнены Cursor-агентом (образовательная симуляция ролей; без impersonation).</w:t>
+      </w:r>
+    </w:p>
+    <w:p>
+      <w:pPr>
+        <w:spacing w:after="120" w:line="276" w:lineRule="auto"/>
+      </w:pPr>
+      <w:r>
+        <w:rPr>
+          <w:rFonts w:ascii="Times New Roman" w:hAnsi="Times New Roman" w:eastAsia="Times New Roman"/>
+          <w:b w:val="0"/>
+          <w:sz w:val="24"/>
+        </w:rPr>
+        <w:t>Retest 2026-10-10: 3 passed in 14.40s. Retest 2026-10-11: 3 passed in 8.74s.</w:t>
       </w:r>
     </w:p>
     <w:p>
@@ -927,7 +927,7 @@
           <w:b w:val="0"/>
           <w:sz w:val="18"/>
         </w:rPr>
-        <w:t>============================= 3 passed in 14.40s ==============================</w:t>
+        <w:t>============================== 3 passed in 8.74s ==============================</w:t>
       </w:r>
     </w:p>
     <w:p>
@@ -1126,7 +1126,7 @@
           <w:b/>
           <w:sz w:val="28"/>
         </w:rPr>
-        <w:t>10. Jira (оригинальное требование)</w:t>
+        <w:t>11. Jira assignments / comments / transitions</w:t>
       </w:r>
     </w:p>
     <w:p>
@@ -1139,7 +1139,7 @@
           <w:b/>
           <w:sz w:val="24"/>
         </w:rPr>
-        <w:t>Создание реального проекта QAKT04 / issues / workflow / native reports: BLOCKED — нет авторизованного доступа к Jira в этой сессии; внешние изменения требуют явного разрешения пользователя. Черновики: docs/kt04/jira-project.md, jira-issue-drafts.md, defect-lifecycle.md, jira-reporting.md. GitHub Issues #1–#3 сохранены.</w:t>
+        <w:t>Фактические назначения, комментарии и переходы в Jira: отсутствуют (BLOCKED). План: docs/kt04/defect-lifecycle.md.</w:t>
       </w:r>
     </w:p>
     <w:p>
@@ -1152,7 +1152,7 @@
           <w:b/>
           <w:sz w:val="28"/>
         </w:rPr>
-        <w:t>11. Заключение</w:t>
+        <w:t>12. Нативные отчёты Jira</w:t>
       </w:r>
     </w:p>
     <w:p>
@@ -1165,7 +1165,422 @@
           <w:b w:val="0"/>
           <w:sz w:val="24"/>
         </w:rPr>
-        <w:t>КТ 04: исторический seeded suite 2 PASS / 3 FAIL + GitHub Issues сохранены; lifecycle-фиксы и Selenium retest 3/3 PASS добавлены. Полный цикл в Jira остаётся BLOCKED до доступа пользователя.</w:t>
+        <w:t>Native filters/dashboards/statistics недоступны без проекта. Локальные таблицы не выдаются за отчёты Jira. См. docs/kt04/jira-reporting.md.</w:t>
+      </w:r>
+    </w:p>
+    <w:p>
+      <w:pPr>
+        <w:pStyle w:val="Heading1"/>
+      </w:pPr>
+      <w:r>
+        <w:rPr>
+          <w:rFonts w:ascii="Times New Roman" w:hAnsi="Times New Roman" w:eastAsia="Times New Roman"/>
+          <w:b/>
+          <w:sz w:val="28"/>
+        </w:rPr>
+        <w:t>13. Матрица соответствия требованиям</w:t>
+      </w:r>
+    </w:p>
+    <w:tbl>
+      <w:tblPr>
+        <w:tblStyle w:val="TableGrid"/>
+        <w:tblW w:type="auto" w:w="0"/>
+        <w:tblLook w:firstColumn="1" w:firstRow="1" w:lastColumn="0" w:lastRow="0" w:noHBand="0" w:noVBand="1" w:val="04A0"/>
+      </w:tblPr>
+      <w:tblGrid>
+        <w:gridCol w:w="3324"/>
+        <w:gridCol w:w="3324"/>
+        <w:gridCol w:w="3324"/>
+      </w:tblGrid>
+      <w:tr>
+        <w:tc>
+          <w:tcPr>
+            <w:tcW w:type="dxa" w:w="3324"/>
+          </w:tcPr>
+          <w:p>
+            <w:r>
+              <w:t>Требование</w:t>
+            </w:r>
+          </w:p>
+        </w:tc>
+        <w:tc>
+          <w:tcPr>
+            <w:tcW w:type="dxa" w:w="3324"/>
+          </w:tcPr>
+          <w:p>
+            <w:r>
+              <w:t>Статус</w:t>
+            </w:r>
+          </w:p>
+        </w:tc>
+        <w:tc>
+          <w:tcPr>
+            <w:tcW w:type="dxa" w:w="3324"/>
+          </w:tcPr>
+          <w:p>
+            <w:r>
+              <w:t>Доказательство</w:t>
+            </w:r>
+          </w:p>
+        </w:tc>
+      </w:tr>
+      <w:tr>
+        <w:tc>
+          <w:tcPr>
+            <w:tcW w:type="dxa" w:w="3324"/>
+          </w:tcPr>
+          <w:p>
+            <w:r>
+              <w:t>Ознакомление с Jira</w:t>
+            </w:r>
+          </w:p>
+        </w:tc>
+        <w:tc>
+          <w:tcPr>
+            <w:tcW w:type="dxa" w:w="3324"/>
+          </w:tcPr>
+          <w:p>
+            <w:r>
+              <w:t>PARTIAL</w:t>
+            </w:r>
+          </w:p>
+        </w:tc>
+        <w:tc>
+          <w:tcPr>
+            <w:tcW w:type="dxa" w:w="3324"/>
+          </w:tcPr>
+          <w:p>
+            <w:r>
+              <w:t>Описание; UI login открыт</w:t>
+            </w:r>
+          </w:p>
+        </w:tc>
+      </w:tr>
+      <w:tr>
+        <w:tc>
+          <w:tcPr>
+            <w:tcW w:type="dxa" w:w="3324"/>
+          </w:tcPr>
+          <w:p>
+            <w:r>
+              <w:t>Создание проекта</w:t>
+            </w:r>
+          </w:p>
+        </w:tc>
+        <w:tc>
+          <w:tcPr>
+            <w:tcW w:type="dxa" w:w="3324"/>
+          </w:tcPr>
+          <w:p>
+            <w:r>
+              <w:t>BLOCKED</w:t>
+            </w:r>
+          </w:p>
+        </w:tc>
+        <w:tc>
+          <w:tcPr>
+            <w:tcW w:type="dxa" w:w="3324"/>
+          </w:tcPr>
+          <w:p>
+            <w:r>
+              <w:t>jira-project.md</w:t>
+            </w:r>
+          </w:p>
+        </w:tc>
+      </w:tr>
+      <w:tr>
+        <w:tc>
+          <w:tcPr>
+            <w:tcW w:type="dxa" w:w="3324"/>
+          </w:tcPr>
+          <w:p>
+            <w:r>
+              <w:t>Типы/приоритеты/компоненты/workflow</w:t>
+            </w:r>
+          </w:p>
+        </w:tc>
+        <w:tc>
+          <w:tcPr>
+            <w:tcW w:type="dxa" w:w="3324"/>
+          </w:tcPr>
+          <w:p>
+            <w:r>
+              <w:t>BLOCKED</w:t>
+            </w:r>
+          </w:p>
+        </w:tc>
+        <w:tc>
+          <w:tcPr>
+            <w:tcW w:type="dxa" w:w="3324"/>
+          </w:tcPr>
+          <w:p>
+            <w:r>
+              <w:t>план, не применено</w:t>
+            </w:r>
+          </w:p>
+        </w:tc>
+      </w:tr>
+      <w:tr>
+        <w:tc>
+          <w:tcPr>
+            <w:tcW w:type="dxa" w:w="3324"/>
+          </w:tcPr>
+          <w:p>
+            <w:r>
+              <w:t>Детальные баг-репорты</w:t>
+            </w:r>
+          </w:p>
+        </w:tc>
+        <w:tc>
+          <w:tcPr>
+            <w:tcW w:type="dxa" w:w="3324"/>
+          </w:tcPr>
+          <w:p>
+            <w:r>
+              <w:t>PASS (local+GitHub)</w:t>
+            </w:r>
+          </w:p>
+        </w:tc>
+        <w:tc>
+          <w:tcPr>
+            <w:tcW w:type="dxa" w:w="3324"/>
+          </w:tcPr>
+          <w:p>
+            <w:r>
+              <w:t>bug-reports.md</w:t>
+            </w:r>
+          </w:p>
+        </w:tc>
+      </w:tr>
+      <w:tr>
+        <w:tc>
+          <w:tcPr>
+            <w:tcW w:type="dxa" w:w="3324"/>
+          </w:tcPr>
+          <w:p>
+            <w:r>
+              <w:t>Назначения / комментарии Jira</w:t>
+            </w:r>
+          </w:p>
+        </w:tc>
+        <w:tc>
+          <w:tcPr>
+            <w:tcW w:type="dxa" w:w="3324"/>
+          </w:tcPr>
+          <w:p>
+            <w:r>
+              <w:t>BLOCKED</w:t>
+            </w:r>
+          </w:p>
+        </w:tc>
+        <w:tc>
+          <w:tcPr>
+            <w:tcW w:type="dxa" w:w="3324"/>
+          </w:tcPr>
+          <w:p>
+            <w:r>
+              <w:t>—</w:t>
+            </w:r>
+          </w:p>
+        </w:tc>
+      </w:tr>
+      <w:tr>
+        <w:tc>
+          <w:tcPr>
+            <w:tcW w:type="dxa" w:w="3324"/>
+          </w:tcPr>
+          <w:p>
+            <w:r>
+              <w:t>Переходы workflow</w:t>
+            </w:r>
+          </w:p>
+        </w:tc>
+        <w:tc>
+          <w:tcPr>
+            <w:tcW w:type="dxa" w:w="3324"/>
+          </w:tcPr>
+          <w:p>
+            <w:r>
+              <w:t>BLOCKED</w:t>
+            </w:r>
+          </w:p>
+        </w:tc>
+        <w:tc>
+          <w:tcPr>
+            <w:tcW w:type="dxa" w:w="3324"/>
+          </w:tcPr>
+          <w:p>
+            <w:r>
+              <w:t>—</w:t>
+            </w:r>
+          </w:p>
+        </w:tc>
+      </w:tr>
+      <w:tr>
+        <w:tc>
+          <w:tcPr>
+            <w:tcW w:type="dxa" w:w="3324"/>
+          </w:tcPr>
+          <w:p>
+            <w:r>
+              <w:t>Исправление дефектов</w:t>
+            </w:r>
+          </w:p>
+        </w:tc>
+        <w:tc>
+          <w:tcPr>
+            <w:tcW w:type="dxa" w:w="3324"/>
+          </w:tcPr>
+          <w:p>
+            <w:r>
+              <w:t>PASS (lifecycle copy)</w:t>
+            </w:r>
+          </w:p>
+        </w:tc>
+        <w:tc>
+          <w:tcPr>
+            <w:tcW w:type="dxa" w:w="3324"/>
+          </w:tcPr>
+          <w:p>
+            <w:r>
+              <w:t>kt04_lifecycle/</w:t>
+            </w:r>
+          </w:p>
+        </w:tc>
+      </w:tr>
+      <w:tr>
+        <w:tc>
+          <w:tcPr>
+            <w:tcW w:type="dxa" w:w="3324"/>
+          </w:tcPr>
+          <w:p>
+            <w:r>
+              <w:t>Retest</w:t>
+            </w:r>
+          </w:p>
+        </w:tc>
+        <w:tc>
+          <w:tcPr>
+            <w:tcW w:type="dxa" w:w="3324"/>
+          </w:tcPr>
+          <w:p>
+            <w:r>
+              <w:t>PASS</w:t>
+            </w:r>
+          </w:p>
+        </w:tc>
+        <w:tc>
+          <w:tcPr>
+            <w:tcW w:type="dxa" w:w="3324"/>
+          </w:tcPr>
+          <w:p>
+            <w:r>
+              <w:t>3/3 в 8.74s</w:t>
+            </w:r>
+          </w:p>
+        </w:tc>
+      </w:tr>
+      <w:tr>
+        <w:tc>
+          <w:tcPr>
+            <w:tcW w:type="dxa" w:w="3324"/>
+          </w:tcPr>
+          <w:p>
+            <w:r>
+              <w:t>Закрытие в Jira</w:t>
+            </w:r>
+          </w:p>
+        </w:tc>
+        <w:tc>
+          <w:tcPr>
+            <w:tcW w:type="dxa" w:w="3324"/>
+          </w:tcPr>
+          <w:p>
+            <w:r>
+              <w:t>BLOCKED</w:t>
+            </w:r>
+          </w:p>
+        </w:tc>
+        <w:tc>
+          <w:tcPr>
+            <w:tcW w:type="dxa" w:w="3324"/>
+          </w:tcPr>
+          <w:p>
+            <w:r>
+              <w:t>—</w:t>
+            </w:r>
+          </w:p>
+        </w:tc>
+      </w:tr>
+      <w:tr>
+        <w:tc>
+          <w:tcPr>
+            <w:tcW w:type="dxa" w:w="3324"/>
+          </w:tcPr>
+          <w:p>
+            <w:r>
+              <w:t>Статистика / native reports</w:t>
+            </w:r>
+          </w:p>
+        </w:tc>
+        <w:tc>
+          <w:tcPr>
+            <w:tcW w:type="dxa" w:w="3324"/>
+          </w:tcPr>
+          <w:p>
+            <w:r>
+              <w:t>BLOCKED</w:t>
+            </w:r>
+          </w:p>
+        </w:tc>
+        <w:tc>
+          <w:tcPr>
+            <w:tcW w:type="dxa" w:w="3324"/>
+          </w:tcPr>
+          <w:p>
+            <w:r>
+              <w:t>jira-reporting.md</w:t>
+            </w:r>
+          </w:p>
+        </w:tc>
+      </w:tr>
+    </w:tbl>
+    <w:p>
+      <w:pPr>
+        <w:spacing w:after="120" w:line="276" w:lineRule="auto"/>
+      </w:pPr>
+      <w:r>
+        <w:rPr>
+          <w:rFonts w:ascii="Times New Roman" w:hAnsi="Times New Roman" w:eastAsia="Times New Roman"/>
+          <w:b w:val="0"/>
+          <w:sz w:val="24"/>
+        </w:rPr>
+      </w:r>
+    </w:p>
+    <w:p>
+      <w:pPr>
+        <w:pStyle w:val="Heading1"/>
+      </w:pPr>
+      <w:r>
+        <w:rPr>
+          <w:rFonts w:ascii="Times New Roman" w:hAnsi="Times New Roman" w:eastAsia="Times New Roman"/>
+          <w:b/>
+          <w:sz w:val="28"/>
+        </w:rPr>
+        <w:t>14. Заключение</w:t>
+      </w:r>
+    </w:p>
+    <w:p>
+      <w:pPr>
+        <w:spacing w:after="120" w:line="276" w:lineRule="auto"/>
+      </w:pPr>
+      <w:r>
+        <w:rPr>
+          <w:rFonts w:ascii="Times New Roman" w:hAnsi="Times New Roman" w:eastAsia="Times New Roman"/>
+          <w:b w:val="0"/>
+          <w:sz w:val="24"/>
+        </w:rPr>
+        <w:t>КТ 04 частично выполнена: seeded 2 PASS/3 FAIL, GitHub #1–#3, lifecycle fixes + Selenium retest 3/3 PASS. Полный цикл в реальном Jira — BLOCKED до входа пользователя в Atlassian и явного разрешения создать QAKT04 и issues. КТ 04 не отмечается как 100% complete.</w:t>
       </w:r>
     </w:p>
     <w:sectPr>

</xml_diff>

<commit_message>
fix(kt04): demonstrate defect fixes and Jira lifecycle
Create collegeqakt04 Jira project KAN with Bugs KAN-4/5/6 through Done; refresh DOCX evidence.

Co-authored-by: Cursor <cursoragent@cursor.com>
</commit_message>
<xml_diff>
--- a/reports/KT04.docx
+++ b/reports/KT04.docx
@@ -136,7 +136,7 @@
           <w:b/>
           <w:sz w:val="28"/>
         </w:rPr>
-        <w:t>1. Цель работы (по заданию преподавателя)</w:t>
+        <w:t>1. Цель работы</w:t>
       </w:r>
     </w:p>
     <w:p>
@@ -149,7 +149,7 @@
           <w:b w:val="0"/>
           <w:sz w:val="24"/>
         </w:rPr>
-        <w:t>Ознакомиться с возможностями Jira; создать проект; настроить типы/приоритеты/workflow/компоненты; оформить баг-репорты; назначить задачи; провести дефекты по стадиям; исправить и перепроверить; закрыть; показать статистику и отчёты Jira.</w:t>
+        <w:t>Ознакомиться с Jira; создать проект; настроить типы/приоритеты/workflow; оформить баг-репорты; назначить; провести по стадиям; исправить; ретест; закрыть; показать статистику и отчёты Jira.</w:t>
       </w:r>
     </w:p>
     <w:p>
@@ -162,7 +162,7 @@
           <w:b/>
           <w:sz w:val="28"/>
         </w:rPr>
-        <w:t>2. Обзор Jira и фактический статус доступа</w:t>
+        <w:t>2. Реальный проект Jira</w:t>
       </w:r>
     </w:p>
     <w:p>
@@ -172,10 +172,75 @@
       <w:r>
         <w:rPr>
           <w:rFonts w:ascii="Times New Roman" w:hAnsi="Times New Roman" w:eastAsia="Times New Roman"/>
-          <w:b/>
+          <w:b w:val="0"/>
           <w:sz w:val="24"/>
         </w:rPr>
-        <w:t>Jira — система учёта задач/дефектов с workflow, назначениями, комментариями и отчётностью. В этой сессии реального workspace нет: открыта страница входа Atlassian (id.atlassian.com/login), MCP/API credentials отсутствуют. Проект QAKT04 и issue keys НЕ создавались (не выдуманы).</w:t>
+        <w:t>Site: https://collegeqakt04.atlassian.net</w:t>
+      </w:r>
+    </w:p>
+    <w:p>
+      <w:pPr>
+        <w:spacing w:after="120" w:line="276" w:lineRule="auto"/>
+      </w:pPr>
+      <w:r>
+        <w:rPr>
+          <w:rFonts w:ascii="Times New Roman" w:hAnsi="Times New Roman" w:eastAsia="Times New Roman"/>
+          <w:b w:val="0"/>
+          <w:sz w:val="24"/>
+        </w:rPr>
+        <w:t>Project: College QA Defect Lifecycle, key KAN (planned QAKT04 — auto key KAN).</w:t>
+      </w:r>
+    </w:p>
+    <w:p>
+      <w:pPr>
+        <w:spacing w:after="120" w:line="276" w:lineRule="auto"/>
+      </w:pPr>
+      <w:r>
+        <w:rPr>
+          <w:rFonts w:ascii="Times New Roman" w:hAnsi="Times New Roman" w:eastAsia="Times New Roman"/>
+          <w:b w:val="0"/>
+          <w:sz w:val="24"/>
+        </w:rPr>
+        <w:t>Board: https://collegeqakt04.atlassian.net/jira/software/projects/KAN/boards/2</w:t>
+      </w:r>
+    </w:p>
+    <w:p>
+      <w:pPr>
+        <w:spacing w:after="120" w:line="276" w:lineRule="auto"/>
+      </w:pPr>
+      <w:r>
+        <w:rPr>
+          <w:rFonts w:ascii="Times New Roman" w:hAnsi="Times New Roman" w:eastAsia="Times New Roman"/>
+          <w:b w:val="0"/>
+          <w:sz w:val="24"/>
+        </w:rPr>
+        <w:t>Issue types: Epic, Story, Task, Баг, Subtask (Bug добавлен вручную).</w:t>
+      </w:r>
+    </w:p>
+    <w:p>
+      <w:pPr>
+        <w:spacing w:after="120" w:line="276" w:lineRule="auto"/>
+      </w:pPr>
+      <w:r>
+        <w:rPr>
+          <w:rFonts w:ascii="Times New Roman" w:hAnsi="Times New Roman" w:eastAsia="Times New Roman"/>
+          <w:b w:val="0"/>
+          <w:sz w:val="24"/>
+        </w:rPr>
+        <w:t>Workflow: Open → In Progress → Ready for Testing → Done.</w:t>
+      </w:r>
+    </w:p>
+    <w:p>
+      <w:pPr>
+        <w:spacing w:after="120" w:line="276" w:lineRule="auto"/>
+      </w:pPr>
+      <w:r>
+        <w:rPr>
+          <w:rFonts w:ascii="Times New Roman" w:hAnsi="Times New Roman" w:eastAsia="Times New Roman"/>
+          <w:b w:val="0"/>
+          <w:sz w:val="24"/>
+        </w:rPr>
+        <w:t>Components: labels authentication / registration / order-processing.</w:t>
       </w:r>
     </w:p>
     <w:p>
@@ -188,7 +253,7 @@
           <w:b/>
           <w:sz w:val="28"/>
         </w:rPr>
-        <w:t>3. Планируемая конфигурация проекта QAKT04</w:t>
+        <w:t>3. Три реальных Jira Bug</w:t>
       </w:r>
     </w:p>
     <w:p>
@@ -201,7 +266,7 @@
           <w:b w:val="0"/>
           <w:sz w:val="24"/>
         </w:rPr>
-        <w:t>Name: College QA Defect Lifecycle; Key: QAKT04; Kanban/Software если доступно.</w:t>
+        <w:t>KAN-4 — Login accepts empty password — High — Done — assignee JEESUS</w:t>
       </w:r>
     </w:p>
     <w:p>
@@ -214,7 +279,7 @@
           <w:b w:val="0"/>
           <w:sz w:val="24"/>
         </w:rPr>
-        <w:t>Issue types: Bug, Task, Improvement. Components: Authentication, Registration, Order Processing.</w:t>
+        <w:t>https://collegeqakt04.atlassian.net/browse/KAN-4</w:t>
       </w:r>
     </w:p>
     <w:p>
@@ -227,7 +292,7 @@
           <w:b w:val="0"/>
           <w:sz w:val="24"/>
         </w:rPr>
-        <w:t>Workflow (план): Open → In Progress → Ready for Testing → Done.</w:t>
+        <w:t>KAN-5 — Registration accepts email without TLD — High — Done</w:t>
       </w:r>
     </w:p>
     <w:p>
@@ -240,7 +305,46 @@
           <w:b w:val="0"/>
           <w:sz w:val="24"/>
         </w:rPr>
-        <w:t>Факт: конфигурация не применена — docs/kt04/jira-project.md.</w:t>
+        <w:t>https://collegeqakt04.atlassian.net/browse/KAN-5</w:t>
+      </w:r>
+    </w:p>
+    <w:p>
+      <w:pPr>
+        <w:spacing w:after="120" w:line="276" w:lineRule="auto"/>
+      </w:pPr>
+      <w:r>
+        <w:rPr>
+          <w:rFonts w:ascii="Times New Roman" w:hAnsi="Times New Roman" w:eastAsia="Times New Roman"/>
+          <w:b w:val="0"/>
+          <w:sz w:val="24"/>
+        </w:rPr>
+        <w:t>KAN-6 — Order accepts quantity zero — Medium — Done</w:t>
+      </w:r>
+    </w:p>
+    <w:p>
+      <w:pPr>
+        <w:spacing w:after="120" w:line="276" w:lineRule="auto"/>
+      </w:pPr>
+      <w:r>
+        <w:rPr>
+          <w:rFonts w:ascii="Times New Roman" w:hAnsi="Times New Roman" w:eastAsia="Times New Roman"/>
+          <w:b w:val="0"/>
+          <w:sz w:val="24"/>
+        </w:rPr>
+        <w:t>https://collegeqakt04.atlassian.net/browse/KAN-6</w:t>
+      </w:r>
+    </w:p>
+    <w:p>
+      <w:pPr>
+        <w:spacing w:after="120" w:line="276" w:lineRule="auto"/>
+      </w:pPr>
+      <w:r>
+        <w:rPr>
+          <w:rFonts w:ascii="Times New Roman" w:hAnsi="Times New Roman" w:eastAsia="Times New Roman"/>
+          <w:b w:val="0"/>
+          <w:sz w:val="24"/>
+        </w:rPr>
+        <w:t>GitHub #1–#3 сохранены как исторические записи.</w:t>
       </w:r>
     </w:p>
     <w:p>
@@ -253,7 +357,7 @@
           <w:b/>
           <w:sz w:val="28"/>
         </w:rPr>
-        <w:t>4. Инструменты и среда</w:t>
+        <w:t>4. Исторический seeded suite (не переписывался)</w:t>
       </w:r>
     </w:p>
     <w:p>
@@ -266,33 +370,20 @@
           <w:b w:val="0"/>
           <w:sz w:val="24"/>
         </w:rPr>
-        <w:t>Windows; Python 3.13; pytest 8.4.2; Selenium 4.50; Chrome.</w:t>
+        <w:t>Campus Portal fixtures/kt04: 2 PASS / 3 FAIL (ожидаемые учебные FAIL).</w:t>
       </w:r>
     </w:p>
     <w:p>
       <w:pPr>
-        <w:spacing w:after="120" w:line="276" w:lineRule="auto"/>
+        <w:spacing w:after="0"/>
       </w:pPr>
       <w:r>
         <w:rPr>
-          <w:rFonts w:ascii="Times New Roman" w:hAnsi="Times New Roman" w:eastAsia="Times New Roman"/>
+          <w:rFonts w:ascii="Consolas" w:hAnsi="Consolas" w:eastAsia="Consolas"/>
           <w:b w:val="0"/>
-          <w:sz w:val="24"/>
+          <w:sz w:val="18"/>
         </w:rPr>
-        <w:t>Page Object: LoginPage, RegisterPage, DashboardPage.</w:t>
-      </w:r>
-    </w:p>
-    <w:p>
-      <w:pPr>
-        <w:spacing w:after="120" w:line="276" w:lineRule="auto"/>
-      </w:pPr>
-      <w:r>
-        <w:rPr>
-          <w:rFonts w:ascii="Times New Roman" w:hAnsi="Times New Roman" w:eastAsia="Times New Roman"/>
-          <w:b w:val="0"/>
-          <w:sz w:val="24"/>
-        </w:rPr>
-        <w:t>Исторический трекер: GitHub Issues #1–#3. Jira: BLOCKED.</w:t>
+        <w:t>======================== 3 failed, 2 passed in 18.08s =========================</w:t>
       </w:r>
     </w:p>
     <w:p>
@@ -305,332 +396,7 @@
           <w:b/>
           <w:sz w:val="28"/>
         </w:rPr>
-        <w:t>5. Учебное приложение Campus Portal Demo</w:t>
-      </w:r>
-    </w:p>
-    <w:p>
-      <w:pPr>
-        <w:spacing w:after="120" w:line="276" w:lineRule="auto"/>
-      </w:pPr>
-      <w:r>
-        <w:rPr>
-          <w:rFonts w:ascii="Times New Roman" w:hAnsi="Times New Roman" w:eastAsia="Times New Roman"/>
-          <w:b w:val="0"/>
-          <w:sz w:val="24"/>
-        </w:rPr>
-        <w:t>Локальное HTML/JS приложение (вход, регистрация, заказ). Три намеренных seeded-дефекта в selenium/fixtures/kt04/. Отдельная исправленная копия: selenium/fixtures/kt04_lifecycle/.</w:t>
-      </w:r>
-    </w:p>
-    <w:p>
-      <w:pPr>
-        <w:pStyle w:val="Heading1"/>
-      </w:pPr>
-      <w:r>
-        <w:rPr>
-          <w:rFonts w:ascii="Times New Roman" w:hAnsi="Times New Roman" w:eastAsia="Times New Roman"/>
-          <w:b/>
-          <w:sz w:val="28"/>
-        </w:rPr>
-        <w:t>6. Исторические тест-кейсы (seeded)</w:t>
-      </w:r>
-    </w:p>
-    <w:p>
-      <w:pPr>
-        <w:spacing w:after="120" w:line="276" w:lineRule="auto"/>
-      </w:pPr>
-      <w:r>
-        <w:rPr>
-          <w:rFonts w:ascii="Times New Roman" w:hAnsi="Times New Roman" w:eastAsia="Times New Roman"/>
-          <w:b w:val="0"/>
-          <w:sz w:val="24"/>
-        </w:rPr>
-        <w:t>TC-01 Валидный вход — PASS</w:t>
-      </w:r>
-    </w:p>
-    <w:p>
-      <w:pPr>
-        <w:spacing w:after="120" w:line="276" w:lineRule="auto"/>
-      </w:pPr>
-      <w:r>
-        <w:rPr>
-          <w:rFonts w:ascii="Times New Roman" w:hAnsi="Times New Roman" w:eastAsia="Times New Roman"/>
-          <w:b w:val="0"/>
-          <w:sz w:val="24"/>
-        </w:rPr>
-        <w:t>TC-02 Пустой пароль должен отклоняться — FAIL (SEED-001)</w:t>
-      </w:r>
-    </w:p>
-    <w:p>
-      <w:pPr>
-        <w:spacing w:after="120" w:line="276" w:lineRule="auto"/>
-      </w:pPr>
-      <w:r>
-        <w:rPr>
-          <w:rFonts w:ascii="Times New Roman" w:hAnsi="Times New Roman" w:eastAsia="Times New Roman"/>
-          <w:b w:val="0"/>
-          <w:sz w:val="24"/>
-        </w:rPr>
-        <w:t>TC-03 Email без TLD должен отклоняться — FAIL (SEED-002)</w:t>
-      </w:r>
-    </w:p>
-    <w:p>
-      <w:pPr>
-        <w:spacing w:after="120" w:line="276" w:lineRule="auto"/>
-      </w:pPr>
-      <w:r>
-        <w:rPr>
-          <w:rFonts w:ascii="Times New Roman" w:hAnsi="Times New Roman" w:eastAsia="Times New Roman"/>
-          <w:b w:val="0"/>
-          <w:sz w:val="24"/>
-        </w:rPr>
-        <w:t>TC-04 Количество 0 должно отклоняться — FAIL (SEED-003)</w:t>
-      </w:r>
-    </w:p>
-    <w:p>
-      <w:pPr>
-        <w:spacing w:after="120" w:line="276" w:lineRule="auto"/>
-      </w:pPr>
-      <w:r>
-        <w:rPr>
-          <w:rFonts w:ascii="Times New Roman" w:hAnsi="Times New Roman" w:eastAsia="Times New Roman"/>
-          <w:b w:val="0"/>
-          <w:sz w:val="24"/>
-        </w:rPr>
-        <w:t>TC-05 Валидный заказ — PASS</w:t>
-      </w:r>
-    </w:p>
-    <w:p>
-      <w:pPr>
-        <w:spacing w:after="0" w:before="0"/>
-      </w:pPr>
-      <w:r>
-        <w:rPr>
-          <w:rFonts w:ascii="Consolas" w:hAnsi="Consolas" w:eastAsia="Consolas"/>
-          <w:b w:val="0"/>
-          <w:sz w:val="18"/>
-        </w:rPr>
-        <w:t>collected 5 items</w:t>
-      </w:r>
-    </w:p>
-    <w:p>
-      <w:pPr>
-        <w:spacing w:after="0" w:before="0"/>
-      </w:pPr>
-      <w:r>
-        <w:rPr>
-          <w:rFonts w:ascii="Consolas" w:hAnsi="Consolas" w:eastAsia="Consolas"/>
-          <w:b w:val="0"/>
-          <w:sz w:val="18"/>
-        </w:rPr>
-        <w:t>test_tc01_valid_login_passes PASSED</w:t>
-      </w:r>
-    </w:p>
-    <w:p>
-      <w:pPr>
-        <w:spacing w:after="0" w:before="0"/>
-      </w:pPr>
-      <w:r>
-        <w:rPr>
-          <w:rFonts w:ascii="Consolas" w:hAnsi="Consolas" w:eastAsia="Consolas"/>
-          <w:b w:val="0"/>
-          <w:sz w:val="18"/>
-        </w:rPr>
-        <w:t>test_tc02_empty_password_should_be_rejected FAILED</w:t>
-      </w:r>
-    </w:p>
-    <w:p>
-      <w:pPr>
-        <w:spacing w:after="0" w:before="0"/>
-      </w:pPr>
-      <w:r>
-        <w:rPr>
-          <w:rFonts w:ascii="Consolas" w:hAnsi="Consolas" w:eastAsia="Consolas"/>
-          <w:b w:val="0"/>
-          <w:sz w:val="18"/>
-        </w:rPr>
-        <w:t>test_tc03_invalid_email_should_be_rejected FAILED</w:t>
-      </w:r>
-    </w:p>
-    <w:p>
-      <w:pPr>
-        <w:spacing w:after="0" w:before="0"/>
-      </w:pPr>
-      <w:r>
-        <w:rPr>
-          <w:rFonts w:ascii="Consolas" w:hAnsi="Consolas" w:eastAsia="Consolas"/>
-          <w:b w:val="0"/>
-          <w:sz w:val="18"/>
-        </w:rPr>
-        <w:t>test_tc04_zero_quantity_should_be_rejected FAILED</w:t>
-      </w:r>
-    </w:p>
-    <w:p>
-      <w:pPr>
-        <w:spacing w:after="0" w:before="0"/>
-      </w:pPr>
-      <w:r>
-        <w:rPr>
-          <w:rFonts w:ascii="Consolas" w:hAnsi="Consolas" w:eastAsia="Consolas"/>
-          <w:b w:val="0"/>
-          <w:sz w:val="18"/>
-        </w:rPr>
-        <w:t>test_tc05_valid_order_passes PASSED</w:t>
-      </w:r>
-    </w:p>
-    <w:p>
-      <w:pPr>
-        <w:spacing w:after="0" w:before="0"/>
-      </w:pPr>
-      <w:r>
-        <w:rPr>
-          <w:rFonts w:ascii="Consolas" w:hAnsi="Consolas" w:eastAsia="Consolas"/>
-          <w:b w:val="0"/>
-          <w:sz w:val="18"/>
-        </w:rPr>
-        <w:t>======================== 3 failed, 2 passed in 18.08s =========================</w:t>
-      </w:r>
-    </w:p>
-    <w:p>
-      <w:pPr>
-        <w:spacing w:after="0" w:before="0"/>
-      </w:pPr>
-      <w:r>
-        <w:rPr>
-          <w:rFonts w:ascii="Consolas" w:hAnsi="Consolas" w:eastAsia="Consolas"/>
-          <w:b w:val="0"/>
-          <w:sz w:val="18"/>
-        </w:rPr>
-        <w:t>exit code: 1</w:t>
-      </w:r>
-    </w:p>
-    <w:p>
-      <w:pPr>
-        <w:pStyle w:val="Heading1"/>
-      </w:pPr>
-      <w:r>
-        <w:rPr>
-          <w:rFonts w:ascii="Times New Roman" w:hAnsi="Times New Roman" w:eastAsia="Times New Roman"/>
-          <w:b/>
-          <w:sz w:val="28"/>
-        </w:rPr>
-        <w:t>7. Три дефекта и баг-репорты</w:t>
-      </w:r>
-    </w:p>
-    <w:p>
-      <w:pPr>
-        <w:spacing w:after="120" w:line="276" w:lineRule="auto"/>
-      </w:pPr>
-      <w:r>
-        <w:rPr>
-          <w:rFonts w:ascii="Times New Roman" w:hAnsi="Times New Roman" w:eastAsia="Times New Roman"/>
-          <w:b w:val="0"/>
-          <w:sz w:val="24"/>
-        </w:rPr>
-        <w:t>BUG-KT04-001 / GitHub #1 — пустой пароль (Major/High). Jira key: не создан.</w:t>
-      </w:r>
-    </w:p>
-    <w:p>
-      <w:pPr>
-        <w:spacing w:after="120" w:line="276" w:lineRule="auto"/>
-      </w:pPr>
-      <w:r>
-        <w:rPr>
-          <w:rFonts w:ascii="Times New Roman" w:hAnsi="Times New Roman" w:eastAsia="Times New Roman"/>
-          <w:b w:val="0"/>
-          <w:sz w:val="24"/>
-        </w:rPr>
-        <w:t>BUG-KT04-002 / GitHub #2 — email user@mail (Major/High). Jira key: не создан.</w:t>
-      </w:r>
-    </w:p>
-    <w:p>
-      <w:pPr>
-        <w:spacing w:after="120" w:line="276" w:lineRule="auto"/>
-      </w:pPr>
-      <w:r>
-        <w:rPr>
-          <w:rFonts w:ascii="Times New Roman" w:hAnsi="Times New Roman" w:eastAsia="Times New Roman"/>
-          <w:b w:val="0"/>
-          <w:sz w:val="24"/>
-        </w:rPr>
-        <w:t>BUG-KT04-003 / GitHub #3 — qty=0 (Minor/Medium). Jira key: не создан.</w:t>
-      </w:r>
-    </w:p>
-    <w:p>
-      <w:pPr>
-        <w:spacing w:after="120" w:line="276" w:lineRule="auto"/>
-      </w:pPr>
-      <w:r>
-        <w:rPr>
-          <w:rFonts w:ascii="Times New Roman" w:hAnsi="Times New Roman" w:eastAsia="Times New Roman"/>
-          <w:b w:val="0"/>
-          <w:sz w:val="24"/>
-        </w:rPr>
-        <w:t>Карточки: bug-reports/bug-reports.md; registry: docs/kt04/jira-issues.md.</w:t>
-      </w:r>
-    </w:p>
-    <w:p>
-      <w:pPr>
-        <w:pStyle w:val="Heading1"/>
-      </w:pPr>
-      <w:r>
-        <w:rPr>
-          <w:rFonts w:ascii="Times New Roman" w:hAnsi="Times New Roman" w:eastAsia="Times New Roman"/>
-          <w:b/>
-          <w:sz w:val="28"/>
-        </w:rPr>
-        <w:t>8. GitHub Issues (сохранены)</w:t>
-      </w:r>
-    </w:p>
-    <w:p>
-      <w:pPr>
-        <w:spacing w:after="120" w:line="276" w:lineRule="auto"/>
-      </w:pPr>
-      <w:r>
-        <w:rPr>
-          <w:rFonts w:ascii="Times New Roman" w:hAnsi="Times New Roman" w:eastAsia="Times New Roman"/>
-          <w:b w:val="0"/>
-          <w:sz w:val="24"/>
-        </w:rPr>
-        <w:t>https://github.com/JEESUScrised/college-testing/issues/1</w:t>
-      </w:r>
-    </w:p>
-    <w:p>
-      <w:pPr>
-        <w:spacing w:after="120" w:line="276" w:lineRule="auto"/>
-      </w:pPr>
-      <w:r>
-        <w:rPr>
-          <w:rFonts w:ascii="Times New Roman" w:hAnsi="Times New Roman" w:eastAsia="Times New Roman"/>
-          <w:b w:val="0"/>
-          <w:sz w:val="24"/>
-        </w:rPr>
-        <w:t>https://github.com/JEESUScrised/college-testing/issues/2</w:t>
-      </w:r>
-    </w:p>
-    <w:p>
-      <w:pPr>
-        <w:spacing w:after="120" w:line="276" w:lineRule="auto"/>
-      </w:pPr>
-      <w:r>
-        <w:rPr>
-          <w:rFonts w:ascii="Times New Roman" w:hAnsi="Times New Roman" w:eastAsia="Times New Roman"/>
-          <w:b w:val="0"/>
-          <w:sz w:val="24"/>
-        </w:rPr>
-        <w:t>https://github.com/JEESUScrised/college-testing/issues/3</w:t>
-      </w:r>
-    </w:p>
-    <w:p>
-      <w:pPr>
-        <w:pStyle w:val="Heading1"/>
-      </w:pPr>
-      <w:r>
-        <w:rPr>
-          <w:rFonts w:ascii="Times New Roman" w:hAnsi="Times New Roman" w:eastAsia="Times New Roman"/>
-          <w:b/>
-          <w:sz w:val="28"/>
-        </w:rPr>
-        <w:t>9. Скриншоты — исторический seeded suite</w:t>
+        <w:t>5. Скриншоты seeded suite</w:t>
       </w:r>
     </w:p>
     <w:p>
@@ -728,7 +494,7 @@
           <w:b w:val="0"/>
           <w:sz w:val="22"/>
         </w:rPr>
-        <w:t>Рисунок 2 — SEED-001: вход с пустым паролем открыл кабинет</w:t>
+        <w:t>Рисунок 2 — SEED-001: пустой пароль принят</w:t>
       </w:r>
     </w:p>
     <w:p>
@@ -777,7 +543,7 @@
           <w:b w:val="0"/>
           <w:sz w:val="22"/>
         </w:rPr>
-        <w:t>Рисунок 3 — SEED-002: регистрация с email user@mail успешна</w:t>
+        <w:t>Рисунок 3 — SEED-002: email user@mail принят</w:t>
       </w:r>
     </w:p>
     <w:p>
@@ -826,7 +592,7 @@
           <w:b w:val="0"/>
           <w:sz w:val="22"/>
         </w:rPr>
-        <w:t>Рисунок 4 — SEED-003: заказ с количеством 0 принят</w:t>
+        <w:t>Рисунок 4 — SEED-003: qty=0 принят</w:t>
       </w:r>
     </w:p>
     <w:p>
@@ -888,7 +654,7 @@
           <w:b/>
           <w:sz w:val="28"/>
         </w:rPr>
-        <w:t>10. Lifecycle: исправленная копия и before/after</w:t>
+        <w:t>6. Lifecycle copy + Selenium retest</w:t>
       </w:r>
     </w:p>
     <w:p>
@@ -901,25 +667,12 @@
           <w:b w:val="0"/>
           <w:sz w:val="24"/>
         </w:rPr>
-        <w:t>fixtures/kt04 не изменялись. В kt04_lifecycle: reject empty password; email с TLD; reject qty&lt;=0. Исправления выполнены Cursor-агентом (образовательная симуляция ролей; без impersonation).</w:t>
+        <w:t>fixtures/kt04_lifecycle: empty password / email TLD / qty&gt;0. Retest 3 passed in 8.74s.</w:t>
       </w:r>
     </w:p>
     <w:p>
       <w:pPr>
-        <w:spacing w:after="120" w:line="276" w:lineRule="auto"/>
-      </w:pPr>
-      <w:r>
-        <w:rPr>
-          <w:rFonts w:ascii="Times New Roman" w:hAnsi="Times New Roman" w:eastAsia="Times New Roman"/>
-          <w:b w:val="0"/>
-          <w:sz w:val="24"/>
-        </w:rPr>
-        <w:t>Retest 2026-10-10: 3 passed in 14.40s. Retest 2026-10-11: 3 passed in 8.74s.</w:t>
-      </w:r>
-    </w:p>
-    <w:p>
-      <w:pPr>
-        <w:spacing w:after="0" w:before="0"/>
+        <w:spacing w:after="0"/>
       </w:pPr>
       <w:r>
         <w:rPr>
@@ -928,45 +681,6 @@
           <w:sz w:val="18"/>
         </w:rPr>
         <w:t>============================== 3 passed in 8.74s ==============================</w:t>
-      </w:r>
-    </w:p>
-    <w:p>
-      <w:pPr>
-        <w:spacing w:after="0" w:before="0"/>
-      </w:pPr>
-      <w:r>
-        <w:rPr>
-          <w:rFonts w:ascii="Consolas" w:hAnsi="Consolas" w:eastAsia="Consolas"/>
-          <w:b w:val="0"/>
-          <w:sz w:val="18"/>
-        </w:rPr>
-        <w:t>test_lifecycle_empty_password_rejected PASSED</w:t>
-      </w:r>
-    </w:p>
-    <w:p>
-      <w:pPr>
-        <w:spacing w:after="0" w:before="0"/>
-      </w:pPr>
-      <w:r>
-        <w:rPr>
-          <w:rFonts w:ascii="Consolas" w:hAnsi="Consolas" w:eastAsia="Consolas"/>
-          <w:b w:val="0"/>
-          <w:sz w:val="18"/>
-        </w:rPr>
-        <w:t>test_lifecycle_invalid_email_rejected PASSED</w:t>
-      </w:r>
-    </w:p>
-    <w:p>
-      <w:pPr>
-        <w:spacing w:after="0" w:before="0"/>
-      </w:pPr>
-      <w:r>
-        <w:rPr>
-          <w:rFonts w:ascii="Consolas" w:hAnsi="Consolas" w:eastAsia="Consolas"/>
-          <w:b w:val="0"/>
-          <w:sz w:val="18"/>
-        </w:rPr>
-        <w:t>test_lifecycle_zero_quantity_rejected PASSED</w:t>
       </w:r>
     </w:p>
     <w:p>
@@ -1015,7 +729,7 @@
           <w:b w:val="0"/>
           <w:sz w:val="22"/>
         </w:rPr>
-        <w:t>Рисунок 6 — Lifecycle retest SEED-001 REJECTED (PASS)</w:t>
+        <w:t>Рисунок 6 — Lifecycle retest SEED-001 PASS</w:t>
       </w:r>
     </w:p>
     <w:p>
@@ -1064,7 +778,7 @@
           <w:b w:val="0"/>
           <w:sz w:val="22"/>
         </w:rPr>
-        <w:t>Рисунок 7 — Lifecycle retest SEED-002 REJECTED (PASS)</w:t>
+        <w:t>Рисунок 7 — Lifecycle retest SEED-002 PASS</w:t>
       </w:r>
     </w:p>
     <w:p>
@@ -1113,7 +827,7 @@
           <w:b w:val="0"/>
           <w:sz w:val="22"/>
         </w:rPr>
-        <w:t>Рисунок 8 — Lifecycle retest SEED-003 REJECTED (PASS)</w:t>
+        <w:t>Рисунок 8 — Lifecycle retest SEED-003 PASS</w:t>
       </w:r>
     </w:p>
     <w:p>
@@ -1126,7 +840,7 @@
           <w:b/>
           <w:sz w:val="28"/>
         </w:rPr>
-        <w:t>11. Jira assignments / comments / transitions</w:t>
+        <w:t>7. Jira assignments, comments, transitions</w:t>
       </w:r>
     </w:p>
     <w:p>
@@ -1136,10 +850,10 @@
       <w:r>
         <w:rPr>
           <w:rFonts w:ascii="Times New Roman" w:hAnsi="Times New Roman" w:eastAsia="Times New Roman"/>
-          <w:b/>
+          <w:b w:val="0"/>
           <w:sz w:val="24"/>
         </w:rPr>
-        <w:t>Фактические назначения, комментарии и переходы в Jira: отсутствуют (BLOCKED). План: docs/kt04/defect-lifecycle.md.</w:t>
+        <w:t>На каждом баге: assign JEESUS; 3 комментария (triage / fix / retest); переходы Open→In Progress→Ready for Testing→Done. Все роли выполнялись на одном аккаунте JEESUS Cursor-агентом (образовательная симуляция, без impersonation).</w:t>
       </w:r>
     </w:p>
     <w:p>
@@ -1152,7 +866,167 @@
           <w:b/>
           <w:sz w:val="28"/>
         </w:rPr>
-        <w:t>12. Нативные отчёты Jira</w:t>
+        <w:t>8. Скриншоты Jira</w:t>
+      </w:r>
+    </w:p>
+    <w:p>
+      <w:r>
+        <w:drawing>
+          <wp:inline xmlns:a="http://schemas.openxmlformats.org/drawingml/2006/main" xmlns:pic="http://schemas.openxmlformats.org/drawingml/2006/picture">
+            <wp:extent cx="5040000" cy="2398482"/>
+            <wp:docPr id="9" name="Picture 9"/>
+            <wp:cNvGraphicFramePr>
+              <a:graphicFrameLocks noChangeAspect="1"/>
+            </wp:cNvGraphicFramePr>
+            <a:graphic>
+              <a:graphicData uri="http://schemas.openxmlformats.org/drawingml/2006/picture">
+                <pic:pic>
+                  <pic:nvPicPr>
+                    <pic:cNvPr id="0" name="01_board_college_qa.png"/>
+                    <pic:cNvPicPr/>
+                  </pic:nvPicPr>
+                  <pic:blipFill>
+                    <a:blip r:embed="rId16"/>
+                    <a:stretch>
+                      <a:fillRect/>
+                    </a:stretch>
+                  </pic:blipFill>
+                  <pic:spPr>
+                    <a:xfrm>
+                      <a:off x="0" y="0"/>
+                      <a:ext cx="5040000" cy="2398482"/>
+                    </a:xfrm>
+                    <a:prstGeom prst="rect"/>
+                  </pic:spPr>
+                </pic:pic>
+              </a:graphicData>
+            </a:graphic>
+          </wp:inline>
+        </w:drawing>
+      </w:r>
+    </w:p>
+    <w:p>
+      <w:pPr>
+        <w:jc w:val="center"/>
+      </w:pPr>
+      <w:r>
+        <w:rPr>
+          <w:rFonts w:ascii="Times New Roman" w:hAnsi="Times New Roman" w:eastAsia="Times New Roman"/>
+          <w:b w:val="0"/>
+          <w:sz w:val="22"/>
+        </w:rPr>
+        <w:t>Рисунок 9 — Jira board College QA Defect Lifecycle (KAN)</w:t>
+      </w:r>
+    </w:p>
+    <w:p>
+      <w:r>
+        <w:drawing>
+          <wp:inline xmlns:a="http://schemas.openxmlformats.org/drawingml/2006/main" xmlns:pic="http://schemas.openxmlformats.org/drawingml/2006/picture">
+            <wp:extent cx="5040000" cy="2398482"/>
+            <wp:docPr id="10" name="Picture 10"/>
+            <wp:cNvGraphicFramePr>
+              <a:graphicFrameLocks noChangeAspect="1"/>
+            </wp:cNvGraphicFramePr>
+            <a:graphic>
+              <a:graphicData uri="http://schemas.openxmlformats.org/drawingml/2006/picture">
+                <pic:pic>
+                  <pic:nvPicPr>
+                    <pic:cNvPr id="0" name="02_issue_KAN-4.png"/>
+                    <pic:cNvPicPr/>
+                  </pic:nvPicPr>
+                  <pic:blipFill>
+                    <a:blip r:embed="rId17"/>
+                    <a:stretch>
+                      <a:fillRect/>
+                    </a:stretch>
+                  </pic:blipFill>
+                  <pic:spPr>
+                    <a:xfrm>
+                      <a:off x="0" y="0"/>
+                      <a:ext cx="5040000" cy="2398482"/>
+                    </a:xfrm>
+                    <a:prstGeom prst="rect"/>
+                  </pic:spPr>
+                </pic:pic>
+              </a:graphicData>
+            </a:graphic>
+          </wp:inline>
+        </w:drawing>
+      </w:r>
+    </w:p>
+    <w:p>
+      <w:pPr>
+        <w:jc w:val="center"/>
+      </w:pPr>
+      <w:r>
+        <w:rPr>
+          <w:rFonts w:ascii="Times New Roman" w:hAnsi="Times New Roman" w:eastAsia="Times New Roman"/>
+          <w:b w:val="0"/>
+          <w:sz w:val="22"/>
+        </w:rPr>
+        <w:t>Рисунок 10 — Jira KAN-4 Done + comments</w:t>
+      </w:r>
+    </w:p>
+    <w:p>
+      <w:r>
+        <w:drawing>
+          <wp:inline xmlns:a="http://schemas.openxmlformats.org/drawingml/2006/main" xmlns:pic="http://schemas.openxmlformats.org/drawingml/2006/picture">
+            <wp:extent cx="5040000" cy="2398482"/>
+            <wp:docPr id="11" name="Picture 11"/>
+            <wp:cNvGraphicFramePr>
+              <a:graphicFrameLocks noChangeAspect="1"/>
+            </wp:cNvGraphicFramePr>
+            <a:graphic>
+              <a:graphicData uri="http://schemas.openxmlformats.org/drawingml/2006/picture">
+                <pic:pic>
+                  <pic:nvPicPr>
+                    <pic:cNvPr id="0" name="03_filter_bugs_done.png"/>
+                    <pic:cNvPicPr/>
+                  </pic:nvPicPr>
+                  <pic:blipFill>
+                    <a:blip r:embed="rId18"/>
+                    <a:stretch>
+                      <a:fillRect/>
+                    </a:stretch>
+                  </pic:blipFill>
+                  <pic:spPr>
+                    <a:xfrm>
+                      <a:off x="0" y="0"/>
+                      <a:ext cx="5040000" cy="2398482"/>
+                    </a:xfrm>
+                    <a:prstGeom prst="rect"/>
+                  </pic:spPr>
+                </pic:pic>
+              </a:graphicData>
+            </a:graphic>
+          </wp:inline>
+        </w:drawing>
+      </w:r>
+    </w:p>
+    <w:p>
+      <w:pPr>
+        <w:jc w:val="center"/>
+      </w:pPr>
+      <w:r>
+        <w:rPr>
+          <w:rFonts w:ascii="Times New Roman" w:hAnsi="Times New Roman" w:eastAsia="Times New Roman"/>
+          <w:b w:val="0"/>
+          <w:sz w:val="22"/>
+        </w:rPr>
+        <w:t>Рисунок 11 — Jira filter: 3 Bugs Done</w:t>
+      </w:r>
+    </w:p>
+    <w:p>
+      <w:pPr>
+        <w:pStyle w:val="Heading1"/>
+      </w:pPr>
+      <w:r>
+        <w:rPr>
+          <w:rFonts w:ascii="Times New Roman" w:hAnsi="Times New Roman" w:eastAsia="Times New Roman"/>
+          <w:b/>
+          <w:sz w:val="28"/>
+        </w:rPr>
+        <w:t>9. Отчёты / статистика Jira</w:t>
       </w:r>
     </w:p>
     <w:p>
@@ -1165,7 +1039,20 @@
           <w:b w:val="0"/>
           <w:sz w:val="24"/>
         </w:rPr>
-        <w:t>Native filters/dashboards/statistics недоступны без проекта. Локальные таблицы не выдаются за отчёты Jira. См. docs/kt04/jira-reporting.md.</w:t>
+        <w:t>Filter Type=Баг: 3 issues, все Done. High=2, Medium=1.</w:t>
+      </w:r>
+    </w:p>
+    <w:p>
+      <w:pPr>
+        <w:spacing w:after="120" w:line="276" w:lineRule="auto"/>
+      </w:pPr>
+      <w:r>
+        <w:rPr>
+          <w:rFonts w:ascii="Times New Roman" w:hAnsi="Times New Roman" w:eastAsia="Times New Roman"/>
+          <w:b w:val="0"/>
+          <w:sz w:val="24"/>
+        </w:rPr>
+        <w:t>Native issue navigator + board; см. docs/kt04/jira-reporting.md.</w:t>
       </w:r>
     </w:p>
     <w:p>
@@ -1178,7 +1065,7 @@
           <w:b/>
           <w:sz w:val="28"/>
         </w:rPr>
-        <w:t>13. Матрица соответствия требованиям</w:t>
+        <w:t>10. Матрица соответствия</w:t>
       </w:r>
     </w:p>
     <w:tbl>
@@ -1241,7 +1128,7 @@
           </w:tcPr>
           <w:p>
             <w:r>
-              <w:t>PARTIAL</w:t>
+              <w:t>PASS</w:t>
             </w:r>
           </w:p>
         </w:tc>
@@ -1251,7 +1138,7 @@
           </w:tcPr>
           <w:p>
             <w:r>
-              <w:t>Описание; UI login открыт</w:t>
+              <w:t>Реальный сайт collegeqakt04</w:t>
             </w:r>
           </w:p>
         </w:tc>
@@ -1273,7 +1160,7 @@
           </w:tcPr>
           <w:p>
             <w:r>
-              <w:t>BLOCKED</w:t>
+              <w:t>PASS</w:t>
             </w:r>
           </w:p>
         </w:tc>
@@ -1283,7 +1170,7 @@
           </w:tcPr>
           <w:p>
             <w:r>
-              <w:t>jira-project.md</w:t>
+              <w:t>KAN College QA Defect Lifecycle</w:t>
             </w:r>
           </w:p>
         </w:tc>
@@ -1295,7 +1182,7 @@
           </w:tcPr>
           <w:p>
             <w:r>
-              <w:t>Типы/приоритеты/компоненты/workflow</w:t>
+              <w:t>Типы/приоритеты/workflow</w:t>
             </w:r>
           </w:p>
         </w:tc>
@@ -1305,7 +1192,7 @@
           </w:tcPr>
           <w:p>
             <w:r>
-              <w:t>BLOCKED</w:t>
+              <w:t>PASS</w:t>
             </w:r>
           </w:p>
         </w:tc>
@@ -1315,7 +1202,7 @@
           </w:tcPr>
           <w:p>
             <w:r>
-              <w:t>план, не применено</w:t>
+              <w:t>Баг + Ready for Testing</w:t>
             </w:r>
           </w:p>
         </w:tc>
@@ -1337,7 +1224,7 @@
           </w:tcPr>
           <w:p>
             <w:r>
-              <w:t>PASS (local+GitHub)</w:t>
+              <w:t>PASS</w:t>
             </w:r>
           </w:p>
         </w:tc>
@@ -1347,7 +1234,7 @@
           </w:tcPr>
           <w:p>
             <w:r>
-              <w:t>bug-reports.md</w:t>
+              <w:t>KAN-4/5/6 + bug-reports.md</w:t>
             </w:r>
           </w:p>
         </w:tc>
@@ -1359,7 +1246,7 @@
           </w:tcPr>
           <w:p>
             <w:r>
-              <w:t>Назначения / комментарии Jira</w:t>
+              <w:t>Назначения / комментарии</w:t>
             </w:r>
           </w:p>
         </w:tc>
@@ -1369,7 +1256,7 @@
           </w:tcPr>
           <w:p>
             <w:r>
-              <w:t>BLOCKED</w:t>
+              <w:t>PASS</w:t>
             </w:r>
           </w:p>
         </w:tc>
@@ -1379,7 +1266,7 @@
           </w:tcPr>
           <w:p>
             <w:r>
-              <w:t>—</w:t>
+              <w:t>JEESUS + 3 comments/issue</w:t>
             </w:r>
           </w:p>
         </w:tc>
@@ -1401,7 +1288,7 @@
           </w:tcPr>
           <w:p>
             <w:r>
-              <w:t>BLOCKED</w:t>
+              <w:t>PASS</w:t>
             </w:r>
           </w:p>
         </w:tc>
@@ -1411,7 +1298,7 @@
           </w:tcPr>
           <w:p>
             <w:r>
-              <w:t>—</w:t>
+              <w:t>→ Done</w:t>
             </w:r>
           </w:p>
         </w:tc>
@@ -1423,39 +1310,7 @@
           </w:tcPr>
           <w:p>
             <w:r>
-              <w:t>Исправление дефектов</w:t>
-            </w:r>
-          </w:p>
-        </w:tc>
-        <w:tc>
-          <w:tcPr>
-            <w:tcW w:type="dxa" w:w="3324"/>
-          </w:tcPr>
-          <w:p>
-            <w:r>
-              <w:t>PASS (lifecycle copy)</w:t>
-            </w:r>
-          </w:p>
-        </w:tc>
-        <w:tc>
-          <w:tcPr>
-            <w:tcW w:type="dxa" w:w="3324"/>
-          </w:tcPr>
-          <w:p>
-            <w:r>
-              <w:t>kt04_lifecycle/</w:t>
-            </w:r>
-          </w:p>
-        </w:tc>
-      </w:tr>
-      <w:tr>
-        <w:tc>
-          <w:tcPr>
-            <w:tcW w:type="dxa" w:w="3324"/>
-          </w:tcPr>
-          <w:p>
-            <w:r>
-              <w:t>Retest</w:t>
+              <w:t>Исправление + retest</w:t>
             </w:r>
           </w:p>
         </w:tc>
@@ -1475,7 +1330,7 @@
           </w:tcPr>
           <w:p>
             <w:r>
-              <w:t>3/3 в 8.74s</w:t>
+              <w:t>kt04_lifecycle 3/3</w:t>
             </w:r>
           </w:p>
         </w:tc>
@@ -1497,7 +1352,7 @@
           </w:tcPr>
           <w:p>
             <w:r>
-              <w:t>BLOCKED</w:t>
+              <w:t>PASS</w:t>
             </w:r>
           </w:p>
         </w:tc>
@@ -1507,7 +1362,7 @@
           </w:tcPr>
           <w:p>
             <w:r>
-              <w:t>—</w:t>
+              <w:t>Готово</w:t>
             </w:r>
           </w:p>
         </w:tc>
@@ -1519,7 +1374,7 @@
           </w:tcPr>
           <w:p>
             <w:r>
-              <w:t>Статистика / native reports</w:t>
+              <w:t>Статистика / filters</w:t>
             </w:r>
           </w:p>
         </w:tc>
@@ -1529,7 +1384,7 @@
           </w:tcPr>
           <w:p>
             <w:r>
-              <w:t>BLOCKED</w:t>
+              <w:t>PASS</w:t>
             </w:r>
           </w:p>
         </w:tc>
@@ -1539,7 +1394,7 @@
           </w:tcPr>
           <w:p>
             <w:r>
-              <w:t>jira-reporting.md</w:t>
+              <w:t>filter 3 Bugs Done</w:t>
             </w:r>
           </w:p>
         </w:tc>
@@ -1567,7 +1422,7 @@
           <w:b/>
           <w:sz w:val="28"/>
         </w:rPr>
-        <w:t>14. Заключение</w:t>
+        <w:t>11. Заключение</w:t>
       </w:r>
     </w:p>
     <w:p>
@@ -1580,7 +1435,7 @@
           <w:b w:val="0"/>
           <w:sz w:val="24"/>
         </w:rPr>
-        <w:t>КТ 04 частично выполнена: seeded 2 PASS/3 FAIL, GitHub #1–#3, lifecycle fixes + Selenium retest 3/3 PASS. Полный цикл в реальном Jira — BLOCKED до входа пользователя в Atlassian и явного разрешения создать QAKT04 и issues. КТ 04 не отмечается как 100% complete.</w:t>
+        <w:t>КТ 04: реальный Jira проект KAN с тремя Bugs (KAN-4/5/6), полный lifecycle до Done, локальные lifecycle-фиксы и Selenium retest 3/3 PASS. Исторический seeded 2/3 FAIL и GitHub #1–#3 сохранены. Ограничения: ключ KAN вместо QAKT04; components = labels.</w:t>
       </w:r>
     </w:p>
     <w:sectPr>

</xml_diff>

<commit_message>
docs(kt04): verify Jira reporting and project configuration
Remote-verify KAN-4/5/6; document Components PARTIAL (labels); add filter/summary/dashboard evidence.

Co-authored-by: Cursor <cursoragent@cursor.com>
</commit_message>
<xml_diff>
--- a/reports/KT04.docx
+++ b/reports/KT04.docx
@@ -27,7 +27,7 @@
           <w:b w:val="0"/>
           <w:sz w:val="24"/>
         </w:rPr>
-        <w:t>Учебное заведение: ______________________________</w:t>
+        <w:t>Учебное заведение: _______________________</w:t>
       </w:r>
     </w:p>
     <w:p>
@@ -41,7 +41,7 @@
           <w:b w:val="0"/>
           <w:sz w:val="24"/>
         </w:rPr>
-        <w:t>Студент: _______________________________________</w:t>
+        <w:t>Студент: _________________________________</w:t>
       </w:r>
     </w:p>
     <w:p>
@@ -55,7 +55,7 @@
           <w:b w:val="0"/>
           <w:sz w:val="24"/>
         </w:rPr>
-        <w:t>Преподаватель: _________________________________</w:t>
+        <w:t>Преподаватель: ___________________________</w:t>
       </w:r>
     </w:p>
     <w:p>
@@ -69,7 +69,7 @@
           <w:b w:val="0"/>
           <w:sz w:val="24"/>
         </w:rPr>
-        <w:t>Группа: ________________________________________</w:t>
+        <w:t>Группа: __________________________________</w:t>
       </w:r>
     </w:p>
     <w:p>
@@ -123,7 +123,7 @@
           <w:b w:val="0"/>
           <w:sz w:val="24"/>
         </w:rPr>
-        <w:t>Дата обновления: 2026-10-11</w:t>
+        <w:t>Дата обновления: 2026-10-11 (remote Jira verification)</w:t>
       </w:r>
     </w:p>
     <w:p>
@@ -188,7 +188,7 @@
           <w:b w:val="0"/>
           <w:sz w:val="24"/>
         </w:rPr>
-        <w:t>Project: College QA Defect Lifecycle, key KAN (planned QAKT04 — auto key KAN).</w:t>
+        <w:t>Project: College QA Defect Lifecycle, key KAN (team-managed / next-gen).</w:t>
       </w:r>
     </w:p>
     <w:p>
@@ -214,7 +214,7 @@
           <w:b w:val="0"/>
           <w:sz w:val="24"/>
         </w:rPr>
-        <w:t>Issue types: Epic, Story, Task, Баг, Subtask (Bug добавлен вручную).</w:t>
+        <w:t>Issue types: Epic, Story, Task, Баг, Subtask.</w:t>
       </w:r>
     </w:p>
     <w:p>
@@ -240,7 +240,7 @@
           <w:b w:val="0"/>
           <w:sz w:val="24"/>
         </w:rPr>
-        <w:t>Components: labels authentication / registration / order-processing.</w:t>
+        <w:t>Components: PARTIAL — native Components field empty on team-managed project; labels authentication / registration / order-processing used as substitute (not claimed as native Components).</w:t>
       </w:r>
     </w:p>
     <w:p>
@@ -253,7 +253,7 @@
           <w:b/>
           <w:sz w:val="28"/>
         </w:rPr>
-        <w:t>3. Три реальных Jira Bug</w:t>
+        <w:t>3. Три реальных Jira Bug (REST verified)</w:t>
       </w:r>
     </w:p>
     <w:p>
@@ -266,7 +266,7 @@
           <w:b w:val="0"/>
           <w:sz w:val="24"/>
         </w:rPr>
-        <w:t>KAN-4 — Login accepts empty password — High — Done — assignee JEESUS</w:t>
+        <w:t>KAN-4 — Login accepts empty password — High — Done — assignee JEESUS — 3 comments</w:t>
       </w:r>
     </w:p>
     <w:p>
@@ -292,7 +292,7 @@
           <w:b w:val="0"/>
           <w:sz w:val="24"/>
         </w:rPr>
-        <w:t>KAN-5 — Registration accepts email without TLD — High — Done</w:t>
+        <w:t>KAN-5 — Registration accepts email without TLD — High — Done — 3 comments</w:t>
       </w:r>
     </w:p>
     <w:p>
@@ -318,7 +318,7 @@
           <w:b w:val="0"/>
           <w:sz w:val="24"/>
         </w:rPr>
-        <w:t>KAN-6 — Order accepts quantity zero — Medium — Done</w:t>
+        <w:t>KAN-6 — Order accepts quantity zero — Medium — Done — 3 comments</w:t>
       </w:r>
     </w:p>
     <w:p>
@@ -332,6 +332,19 @@
           <w:sz w:val="24"/>
         </w:rPr>
         <w:t>https://collegeqakt04.atlassian.net/browse/KAN-6</w:t>
+      </w:r>
+    </w:p>
+    <w:p>
+      <w:pPr>
+        <w:spacing w:after="120" w:line="276" w:lineRule="auto"/>
+      </w:pPr>
+      <w:r>
+        <w:rPr>
+          <w:rFonts w:ascii="Times New Roman" w:hAnsi="Times New Roman" w:eastAsia="Times New Roman"/>
+          <w:b w:val="0"/>
+          <w:sz w:val="24"/>
+        </w:rPr>
+        <w:t>Changelog KAN-4: Open→In Progress→Ready for Testing→Done.</w:t>
       </w:r>
     </w:p>
     <w:p>
@@ -853,7 +866,7 @@
           <w:b w:val="0"/>
           <w:sz w:val="24"/>
         </w:rPr>
-        <w:t>На каждом баге: assign JEESUS; 3 комментария (triage / fix / retest); переходы Open→In Progress→Ready for Testing→Done. Все роли выполнялись на одном аккаунте JEESUS Cursor-агентом (образовательная симуляция, без impersonation).</w:t>
+        <w:t>На каждом баге: assign JEESUS; 3 комментария (triage / fix / retest); переходы Open→In Progress→Ready for Testing→Done. Все роли на одном аккаунте JEESUS Cursor-агентом (образовательная симуляция).</w:t>
       </w:r>
     </w:p>
     <w:p>
@@ -866,7 +879,7 @@
           <w:b/>
           <w:sz w:val="28"/>
         </w:rPr>
-        <w:t>8. Скриншоты Jira</w:t>
+        <w:t>8. Скриншоты Jira (включая final verification)</w:t>
       </w:r>
     </w:p>
     <w:p>
@@ -931,7 +944,7 @@
               <a:graphicData uri="http://schemas.openxmlformats.org/drawingml/2006/picture">
                 <pic:pic>
                   <pic:nvPicPr>
-                    <pic:cNvPr id="0" name="02_issue_KAN-4.png"/>
+                    <pic:cNvPr id="0" name="02_KAN-4_issue_comments.png"/>
                     <pic:cNvPicPr/>
                   </pic:nvPicPr>
                   <pic:blipFill>
@@ -964,7 +977,7 @@
           <w:b w:val="0"/>
           <w:sz w:val="22"/>
         </w:rPr>
-        <w:t>Рисунок 10 — Jira KAN-4 Done + comments</w:t>
+        <w:t>Рисунок 10 — KAN-4 Done + 3 comments (remote verify)</w:t>
       </w:r>
     </w:p>
     <w:p>
@@ -980,7 +993,7 @@
               <a:graphicData uri="http://schemas.openxmlformats.org/drawingml/2006/picture">
                 <pic:pic>
                   <pic:nvPicPr>
-                    <pic:cNvPr id="0" name="03_filter_bugs_done.png"/>
+                    <pic:cNvPr id="0" name="07_saved_filter_bugs_done.png"/>
                     <pic:cNvPicPr/>
                   </pic:nvPicPr>
                   <pic:blipFill>
@@ -1013,7 +1026,105 @@
           <w:b w:val="0"/>
           <w:sz w:val="22"/>
         </w:rPr>
-        <w:t>Рисунок 11 — Jira filter: 3 Bugs Done</w:t>
+        <w:t>Рисунок 11 — Saved filter KT04 KAN Bugs Done</w:t>
+      </w:r>
+    </w:p>
+    <w:p>
+      <w:r>
+        <w:drawing>
+          <wp:inline xmlns:a="http://schemas.openxmlformats.org/drawingml/2006/main" xmlns:pic="http://schemas.openxmlformats.org/drawingml/2006/picture">
+            <wp:extent cx="5040000" cy="2398482"/>
+            <wp:docPr id="12" name="Picture 12"/>
+            <wp:cNvGraphicFramePr>
+              <a:graphicFrameLocks noChangeAspect="1"/>
+            </wp:cNvGraphicFramePr>
+            <a:graphic>
+              <a:graphicData uri="http://schemas.openxmlformats.org/drawingml/2006/picture">
+                <pic:pic>
+                  <pic:nvPicPr>
+                    <pic:cNvPr id="0" name="04_project_summary.png"/>
+                    <pic:cNvPicPr/>
+                  </pic:nvPicPr>
+                  <pic:blipFill>
+                    <a:blip r:embed="rId19"/>
+                    <a:stretch>
+                      <a:fillRect/>
+                    </a:stretch>
+                  </pic:blipFill>
+                  <pic:spPr>
+                    <a:xfrm>
+                      <a:off x="0" y="0"/>
+                      <a:ext cx="5040000" cy="2398482"/>
+                    </a:xfrm>
+                    <a:prstGeom prst="rect"/>
+                  </pic:spPr>
+                </pic:pic>
+              </a:graphicData>
+            </a:graphic>
+          </wp:inline>
+        </w:drawing>
+      </w:r>
+    </w:p>
+    <w:p>
+      <w:pPr>
+        <w:jc w:val="center"/>
+      </w:pPr>
+      <w:r>
+        <w:rPr>
+          <w:rFonts w:ascii="Times New Roman" w:hAnsi="Times New Roman" w:eastAsia="Times New Roman"/>
+          <w:b w:val="0"/>
+          <w:sz w:val="22"/>
+        </w:rPr>
+        <w:t>Рисунок 12 — Project Summary: Выполнено 3</w:t>
+      </w:r>
+    </w:p>
+    <w:p>
+      <w:r>
+        <w:drawing>
+          <wp:inline xmlns:a="http://schemas.openxmlformats.org/drawingml/2006/main" xmlns:pic="http://schemas.openxmlformats.org/drawingml/2006/picture">
+            <wp:extent cx="5040000" cy="2398482"/>
+            <wp:docPr id="13" name="Picture 13"/>
+            <wp:cNvGraphicFramePr>
+              <a:graphicFrameLocks noChangeAspect="1"/>
+            </wp:cNvGraphicFramePr>
+            <a:graphic>
+              <a:graphicData uri="http://schemas.openxmlformats.org/drawingml/2006/picture">
+                <pic:pic>
+                  <pic:nvPicPr>
+                    <pic:cNvPr id="0" name="05_dashboard_kt04_reports.png"/>
+                    <pic:cNvPicPr/>
+                  </pic:nvPicPr>
+                  <pic:blipFill>
+                    <a:blip r:embed="rId20"/>
+                    <a:stretch>
+                      <a:fillRect/>
+                    </a:stretch>
+                  </pic:blipFill>
+                  <pic:spPr>
+                    <a:xfrm>
+                      <a:off x="0" y="0"/>
+                      <a:ext cx="5040000" cy="2398482"/>
+                    </a:xfrm>
+                    <a:prstGeom prst="rect"/>
+                  </pic:spPr>
+                </pic:pic>
+              </a:graphicData>
+            </a:graphic>
+          </wp:inline>
+        </w:drawing>
+      </w:r>
+    </w:p>
+    <w:p>
+      <w:pPr>
+        <w:jc w:val="center"/>
+      </w:pPr>
+      <w:r>
+        <w:rPr>
+          <w:rFonts w:ascii="Times New Roman" w:hAnsi="Times New Roman" w:eastAsia="Times New Roman"/>
+          <w:b w:val="0"/>
+          <w:sz w:val="22"/>
+        </w:rPr>
+        <w:t>Рисунок 13 — Dashboard KT04 Defect Reports</w:t>
       </w:r>
     </w:p>
     <w:p>
@@ -1026,7 +1137,7 @@
           <w:b/>
           <w:sz w:val="28"/>
         </w:rPr>
-        <w:t>9. Отчёты / статистика Jira</w:t>
+        <w:t>9. Отчёты / статистика Jira (native)</w:t>
       </w:r>
     </w:p>
     <w:p>
@@ -1039,7 +1150,7 @@
           <w:b w:val="0"/>
           <w:sz w:val="24"/>
         </w:rPr>
-        <w:t>Filter Type=Баг: 3 issues, все Done. High=2, Medium=1.</w:t>
+        <w:t>Saved filter: https://collegeqakt04.atlassian.net/issues/?filter=10002</w:t>
       </w:r>
     </w:p>
     <w:p>
@@ -1052,7 +1163,46 @@
           <w:b w:val="0"/>
           <w:sz w:val="24"/>
         </w:rPr>
-        <w:t>Native issue navigator + board; см. docs/kt04/jira-reporting.md.</w:t>
+        <w:t>Dashboard: https://collegeqakt04.atlassian.net/jira/dashboards/10001</w:t>
+      </w:r>
+    </w:p>
+    <w:p>
+      <w:pPr>
+        <w:spacing w:after="120" w:line="276" w:lineRule="auto"/>
+      </w:pPr>
+      <w:r>
+        <w:rPr>
+          <w:rFonts w:ascii="Times New Roman" w:hAnsi="Times New Roman" w:eastAsia="Times New Roman"/>
+          <w:b w:val="0"/>
+          <w:sz w:val="24"/>
+        </w:rPr>
+        <w:t>Summary: https://collegeqakt04.atlassian.net/jira/software/projects/KAN/summary</w:t>
+      </w:r>
+    </w:p>
+    <w:p>
+      <w:pPr>
+        <w:spacing w:after="120" w:line="276" w:lineRule="auto"/>
+      </w:pPr>
+      <w:r>
+        <w:rPr>
+          <w:rFonts w:ascii="Times New Roman" w:hAnsi="Times New Roman" w:eastAsia="Times New Roman"/>
+          <w:b w:val="0"/>
+          <w:sz w:val="24"/>
+        </w:rPr>
+        <w:t>Totals: Bugs=3, Open=0, Done=3, High=2, Medium=1.</w:t>
+      </w:r>
+    </w:p>
+    <w:p>
+      <w:pPr>
+        <w:spacing w:after="120" w:line="276" w:lineRule="auto"/>
+      </w:pPr>
+      <w:r>
+        <w:rPr>
+          <w:rFonts w:ascii="Times New Roman" w:hAnsi="Times New Roman" w:eastAsia="Times New Roman"/>
+          <w:b w:val="0"/>
+          <w:sz w:val="24"/>
+        </w:rPr>
+        <w:t>Limitation: classic board Reports URL 404 on team-managed; dashboard gadgets exist but need UI filter selection; Components breakdown N/A.</w:t>
       </w:r>
     </w:p>
     <w:p>
@@ -1138,7 +1288,7 @@
           </w:tcPr>
           <w:p>
             <w:r>
-              <w:t>Реальный сайт collegeqakt04</w:t>
+              <w:t>collegeqakt04 + REST verify</w:t>
             </w:r>
           </w:p>
         </w:tc>
@@ -1234,7 +1384,7 @@
           </w:tcPr>
           <w:p>
             <w:r>
-              <w:t>KAN-4/5/6 + bug-reports.md</w:t>
+              <w:t>KAN-4/5/6 descriptions</w:t>
             </w:r>
           </w:p>
         </w:tc>
@@ -1298,7 +1448,7 @@
           </w:tcPr>
           <w:p>
             <w:r>
-              <w:t>→ Done</w:t>
+              <w:t>changelog → Done</w:t>
             </w:r>
           </w:p>
         </w:tc>
@@ -1374,7 +1524,7 @@
           </w:tcPr>
           <w:p>
             <w:r>
-              <w:t>Статистика / filters</w:t>
+              <w:t>Native Components</w:t>
             </w:r>
           </w:p>
         </w:tc>
@@ -1384,7 +1534,7 @@
           </w:tcPr>
           <w:p>
             <w:r>
-              <w:t>PASS</w:t>
+              <w:t>PARTIAL</w:t>
             </w:r>
           </w:p>
         </w:tc>
@@ -1394,7 +1544,39 @@
           </w:tcPr>
           <w:p>
             <w:r>
-              <w:t>filter 3 Bugs Done</w:t>
+              <w:t>labels substitute; field empty</w:t>
+            </w:r>
+          </w:p>
+        </w:tc>
+      </w:tr>
+      <w:tr>
+        <w:tc>
+          <w:tcPr>
+            <w:tcW w:type="dxa" w:w="3324"/>
+          </w:tcPr>
+          <w:p>
+            <w:r>
+              <w:t>Статистика / reports</w:t>
+            </w:r>
+          </w:p>
+        </w:tc>
+        <w:tc>
+          <w:tcPr>
+            <w:tcW w:type="dxa" w:w="3324"/>
+          </w:tcPr>
+          <w:p>
+            <w:r>
+              <w:t>PARTIAL</w:t>
+            </w:r>
+          </w:p>
+        </w:tc>
+        <w:tc>
+          <w:tcPr>
+            <w:tcW w:type="dxa" w:w="3324"/>
+          </w:tcPr>
+          <w:p>
+            <w:r>
+              <w:t>filter+summary PASS; gadgets UI pending</w:t>
             </w:r>
           </w:p>
         </w:tc>
@@ -1435,7 +1617,7 @@
           <w:b w:val="0"/>
           <w:sz w:val="24"/>
         </w:rPr>
-        <w:t>КТ 04: реальный Jira проект KAN с тремя Bugs (KAN-4/5/6), полный lifecycle до Done, локальные lifecycle-фиксы и Selenium retest 3/3 PASS. Исторический seeded 2/3 FAIL и GitHub #1–#3 сохранены. Ограничения: ключ KAN вместо QAKT04; components = labels.</w:t>
+        <w:t>КТ 04: реальный Jira проект KAN с тремя Bugs (KAN-4/5/6), полный lifecycle до Done, локальные lifecycle-фиксы и Selenium retest 3/3 PASS. Исторический seeded 2/3 FAIL и GitHub #1–#3 сохранены. Ограничения: ключ KAN; Components = labels (PARTIAL); dashboard gadgets need UI config.</w:t>
       </w:r>
     </w:p>
     <w:sectPr>

</xml_diff>

<commit_message>
docs(kt04): complete dashboard reporting; document Components unavailable
Configure live Jira dashboard gadgets on filter 10002; record team-managed Components 405 limitation.

Co-authored-by: Cursor <cursoragent@cursor.com>
</commit_message>
<xml_diff>
--- a/reports/KT04.docx
+++ b/reports/KT04.docx
@@ -240,7 +240,7 @@
           <w:b w:val="0"/>
           <w:sz w:val="24"/>
         </w:rPr>
-        <w:t>Components: PARTIAL — native Components field empty on team-managed project; labels authentication / registration / order-processing used as substitute (not claimed as native Components).</w:t>
+        <w:t>Components: UNAVAILABLE on team-managed KAN — POST /components returns 405; editmeta has no components field. Labels authentication / registration / order-processing used as substitute (not claimed as native Components). Project not migrated solely for Components.</w:t>
       </w:r>
     </w:p>
     <w:p>
@@ -1091,7 +1091,7 @@
               <a:graphicData uri="http://schemas.openxmlformats.org/drawingml/2006/picture">
                 <pic:pic>
                   <pic:nvPicPr>
-                    <pic:cNvPr id="0" name="05_dashboard_kt04_reports.png"/>
+                    <pic:cNvPr id="0" name="08_dashboard_configured_stats.png"/>
                     <pic:cNvPicPr/>
                   </pic:nvPicPr>
                   <pic:blipFill>
@@ -1124,7 +1124,7 @@
           <w:b w:val="0"/>
           <w:sz w:val="22"/>
         </w:rPr>
-        <w:t>Рисунок 13 — Dashboard KT04 Defect Reports</w:t>
+        <w:t>Рисунок 13 — Dashboard: status/priority charts (configured)</w:t>
       </w:r>
     </w:p>
     <w:p>
@@ -1189,7 +1189,7 @@
           <w:b w:val="0"/>
           <w:sz w:val="24"/>
         </w:rPr>
-        <w:t>Totals: Bugs=3, Open=0, Done=3, High=2, Medium=1.</w:t>
+        <w:t>Totals (re-verified): Bugs=3, Open=0, Done=3, High=2, Medium=1.</w:t>
       </w:r>
     </w:p>
     <w:p>
@@ -1202,7 +1202,20 @@
           <w:b w:val="0"/>
           <w:sz w:val="24"/>
         </w:rPr>
-        <w:t>Limitation: classic board Reports URL 404 on team-managed; dashboard gadgets exist but need UI filter selection; Components breakdown N/A.</w:t>
+        <w:t>Dashboard gadgets configured on filter 10002: Bugs by Status (ГОТОВО=3), Bugs by Priority (High=2 / Medium=1), Priority×Status, KAN Bugs list.</w:t>
+      </w:r>
+    </w:p>
+    <w:p>
+      <w:pPr>
+        <w:spacing w:after="120" w:line="276" w:lineRule="auto"/>
+      </w:pPr>
+      <w:r>
+        <w:rPr>
+          <w:rFonts w:ascii="Times New Roman" w:hAnsi="Times New Roman" w:eastAsia="Times New Roman"/>
+          <w:b w:val="0"/>
+          <w:sz w:val="24"/>
+        </w:rPr>
+        <w:t>Limitation: native Components unavailable (405); Components breakdown N/A.</w:t>
       </w:r>
     </w:p>
     <w:p>
@@ -1544,7 +1557,7 @@
           </w:tcPr>
           <w:p>
             <w:r>
-              <w:t>labels substitute; field empty</w:t>
+              <w:t>UNAVAILABLE on team-managed; labels substitute</w:t>
             </w:r>
           </w:p>
         </w:tc>
@@ -1566,7 +1579,7 @@
           </w:tcPr>
           <w:p>
             <w:r>
-              <w:t>PARTIAL</w:t>
+              <w:t>PASS</w:t>
             </w:r>
           </w:p>
         </w:tc>
@@ -1576,7 +1589,7 @@
           </w:tcPr>
           <w:p>
             <w:r>
-              <w:t>filter+summary PASS; gadgets UI pending</w:t>
+              <w:t>filter + configured dashboard charts</w:t>
             </w:r>
           </w:p>
         </w:tc>
@@ -1617,7 +1630,7 @@
           <w:b w:val="0"/>
           <w:sz w:val="24"/>
         </w:rPr>
-        <w:t>КТ 04: реальный Jira проект KAN с тремя Bugs (KAN-4/5/6), полный lifecycle до Done, локальные lifecycle-фиксы и Selenium retest 3/3 PASS. Исторический seeded 2/3 FAIL и GitHub #1–#3 сохранены. Ограничения: ключ KAN; Components = labels (PARTIAL); dashboard gadgets need UI config.</w:t>
+        <w:t>КТ 04: реальный Jira проект KAN с тремя Bugs (KAN-4/5/6), полный lifecycle до Done, локальные lifecycle-фиксы и Selenium retest 3/3 PASS. Исторический seeded 2/3 FAIL и GitHub #1–#3 сохранены. Ограничения: ключ KAN; native Components UNAVAILABLE on team-managed (labels substitute).</w:t>
       </w:r>
     </w:p>
     <w:sectPr>

</xml_diff>